<commit_message>
Demo reestructurado: marcación del Word como en el DI de la Unidad 3
- Fuera los temas «Cómo se lee un tema» y «Cómo se explica con piezas gráficas» y el glosario; quedan Pautas de diseño, Cómo se marca el Word y el catálogo (temas 3 a 6).
- Introducción y Contenido de la unidad con título literal y menos prosa.
- Cómo se marca el Word reescrito: nombre del componente en rojo, «Título:», partes en tres líneas, rótulos que se leen en color de texto, «Vincular Imagen-N» en PNG, video, audio y PDF.
- Tarjetas del catálogo en esa convención; Cifra destacada, Pasos, Ventana de detalle.
- Referencias sin enlaces, título en cursiva, sin negrilla. Evaluación de cinco preguntas.
- Plantilla de Word regenerada en la misma convención.

Co-Authored-By: Claude Fable 5.1 <noreply@anthropic.com>
</commit_message>
<xml_diff>
--- a/fuente/assets/descargas/PLANTILLA-UNIDAD-SCALA.docx
+++ b/fuente/assets/descargas/PLANTILLA-UNIDAD-SCALA.docx
@@ -28,7 +28,7 @@
         <w:pStyle w:val="Heading1"/>
       </w:pPr>
       <w:r>
-        <w:t>Cómo se lee este documento</w:t>
+        <w:t>Cómo se marca este documento</w:t>
       </w:r>
     </w:p>
     <w:p>
@@ -41,7 +41,7 @@
           <w:i w:val="0"/>
           <w:sz w:val="22"/>
         </w:rPr>
-        <w:t xml:space="preserve">Una sola regla: </w:t>
+        <w:t xml:space="preserve">Tres cosas, y siempre las mismas. </w:t>
       </w:r>
       <w:r>
         <w:rPr>
@@ -49,7 +49,7 @@
           <w:i w:val="0"/>
           <w:sz w:val="22"/>
         </w:rPr>
-        <w:t>lo que está dentro de una caja no es contenido del curso.</w:t>
+        <w:t xml:space="preserve">El contenido va suelto y sale literal, con sus negrillas. </w:t>
       </w:r>
       <w:r>
         <w:rPr>
@@ -57,301 +57,8 @@
           <w:i w:val="0"/>
           <w:sz w:val="22"/>
         </w:rPr>
-        <w:t xml:space="preserve"> El contenido va suelto en la página y sale literal, con sus negrillas. Las cajas le dicen a producción qué hacer con el texto que tienen al lado.</w:t>
+        <w:t>Lo que va en rojo es una instrucción para producción y no se ve en el curso: el nombre de un componente, «Título:», «Tarjeta 1», «Vincular…». Y los rótulos que el estudiante sí lee (Importante, Idea clave…) van en el color del texto, en su propia línea.</w:t>
       </w:r>
-    </w:p>
-    <w:tbl>
-      <w:tblPr>
-        <w:tblW w:type="auto" w:w="0"/>
-        <w:jc w:val="left"/>
-        <w:tblLook w:firstColumn="1" w:firstRow="1" w:lastColumn="0" w:lastRow="0" w:noHBand="0" w:noVBand="1" w:val="04A0"/>
-      </w:tblPr>
-      <w:tblGrid>
-        <w:gridCol w:w="9518"/>
-      </w:tblGrid>
-      <w:tr>
-        <w:tc>
-          <w:tcPr>
-            <w:tcW w:type="dxa" w:w="9518"/>
-            <w:shd w:fill="EFECF7"/>
-            <w:tcBorders>
-              <w:left w:val="single" w:sz="30" w:color="503B96"/>
-              <w:top w:val="single" w:sz="6" w:color="EFECF7"/>
-              <w:bottom w:val="single" w:sz="6" w:color="EFECF7"/>
-              <w:right w:val="single" w:sz="6" w:color="EFECF7"/>
-            </w:tcBorders>
-            <w:tcMar>
-              <w:top w:w="100" w:type="dxa"/>
-              <w:bottom w:w="100" w:type="dxa"/>
-              <w:left w:w="160" w:type="dxa"/>
-              <w:right w:w="160" w:type="dxa"/>
-            </w:tcMar>
-          </w:tcPr>
-          <w:p>
-            <w:pPr>
-              <w:spacing w:after="80"/>
-            </w:pPr>
-            <w:r/>
-            <w:r>
-              <w:rPr>
-                <w:b/>
-                <w:color w:val="503B96"/>
-                <w:sz w:val="16"/>
-                <w:spacing w:val="30"/>
-              </w:rPr>
-              <w:t>COMPONENTE</w:t>
-            </w:r>
-          </w:p>
-          <w:p>
-            <w:pPr>
-              <w:spacing w:after="40"/>
-            </w:pPr>
-            <w:r>
-              <w:rPr>
-                <w:b/>
-                <w:i w:val="0"/>
-                <w:sz w:val="21"/>
-              </w:rPr>
-              <w:t>Acordeón: Las tres preguntas del criterio</w:t>
-            </w:r>
-          </w:p>
-          <w:p>
-            <w:pPr>
-              <w:spacing w:after="40"/>
-            </w:pPr>
-            <w:r>
-              <w:rPr>
-                <w:b/>
-                <w:i w:val="0"/>
-                <w:sz w:val="21"/>
-              </w:rPr>
-              <w:t xml:space="preserve">Ítem: </w:t>
-            </w:r>
-            <w:r>
-              <w:rPr>
-                <w:b w:val="0"/>
-                <w:i w:val="0"/>
-                <w:sz w:val="21"/>
-              </w:rPr>
-              <w:t>¿Qué vamos a decidir? — El criterio nombra la decisión, no el tema.</w:t>
-            </w:r>
-          </w:p>
-          <w:p>
-            <w:pPr>
-              <w:spacing w:after="40"/>
-            </w:pPr>
-            <w:r>
-              <w:rPr>
-                <w:b/>
-                <w:i w:val="0"/>
-                <w:sz w:val="21"/>
-              </w:rPr>
-              <w:t xml:space="preserve">Ítem: </w:t>
-            </w:r>
-            <w:r>
-              <w:rPr>
-                <w:b w:val="0"/>
-                <w:i w:val="0"/>
-                <w:sz w:val="21"/>
-              </w:rPr>
-              <w:t>¿Con qué dato se responde? — Si no hay dato, el criterio no está formulado.</w:t>
-            </w:r>
-          </w:p>
-          <w:p>
-            <w:pPr>
-              <w:spacing w:before="80" w:after="0"/>
-            </w:pPr>
-            <w:r>
-              <w:rPr>
-                <w:i/>
-                <w:color w:val="6E738C"/>
-                <w:sz w:val="18"/>
-              </w:rPr>
-              <w:t>Violeta: el componente que arma la maquetación. El rótulo no se ve en el curso; se ve el título.</w:t>
-            </w:r>
-          </w:p>
-        </w:tc>
-      </w:tr>
-    </w:tbl>
-    <w:p>
-      <w:pPr>
-        <w:spacing w:after="80"/>
-      </w:pPr>
-    </w:p>
-    <w:tbl>
-      <w:tblPr>
-        <w:tblW w:type="auto" w:w="0"/>
-        <w:jc w:val="left"/>
-        <w:tblLook w:firstColumn="1" w:firstRow="1" w:lastColumn="0" w:lastRow="0" w:noHBand="0" w:noVBand="1" w:val="04A0"/>
-      </w:tblPr>
-      <w:tblGrid>
-        <w:gridCol w:w="9518"/>
-      </w:tblGrid>
-      <w:tr>
-        <w:tc>
-          <w:tcPr>
-            <w:tcW w:type="dxa" w:w="9518"/>
-            <w:shd w:fill="FDF4DE"/>
-            <w:tcBorders>
-              <w:left w:val="single" w:sz="30" w:color="C08A00"/>
-              <w:top w:val="single" w:sz="6" w:color="FDF4DE"/>
-              <w:bottom w:val="single" w:sz="6" w:color="FDF4DE"/>
-              <w:right w:val="single" w:sz="6" w:color="FDF4DE"/>
-            </w:tcBorders>
-            <w:tcMar>
-              <w:top w:w="100" w:type="dxa"/>
-              <w:bottom w:w="100" w:type="dxa"/>
-              <w:left w:w="160" w:type="dxa"/>
-              <w:right w:w="160" w:type="dxa"/>
-            </w:tcMar>
-          </w:tcPr>
-          <w:p>
-            <w:pPr>
-              <w:spacing w:after="80"/>
-            </w:pPr>
-            <w:r/>
-            <w:r>
-              <w:rPr>
-                <w:b/>
-                <w:color w:val="8A6100"/>
-                <w:sz w:val="16"/>
-                <w:spacing w:val="30"/>
-              </w:rPr>
-              <w:t>PARA DISEÑO GRÁFICO · NO ES CONTENIDO</w:t>
-            </w:r>
-          </w:p>
-          <w:p>
-            <w:pPr>
-              <w:spacing w:after="40"/>
-            </w:pPr>
-            <w:r>
-              <w:rPr>
-                <w:b/>
-                <w:i w:val="0"/>
-                <w:sz w:val="21"/>
-              </w:rPr>
-              <w:t>Figura [N]</w:t>
-            </w:r>
-          </w:p>
-          <w:p>
-            <w:pPr>
-              <w:spacing w:after="40"/>
-            </w:pPr>
-            <w:r>
-              <w:rPr>
-                <w:b/>
-                <w:i w:val="0"/>
-                <w:sz w:val="21"/>
-              </w:rPr>
-              <w:t xml:space="preserve">Leyenda: </w:t>
-            </w:r>
-            <w:r>
-              <w:rPr>
-                <w:b w:val="0"/>
-                <w:i w:val="0"/>
-                <w:color w:val="6E738C"/>
-                <w:sz w:val="21"/>
-              </w:rPr>
-              <w:t>[pie que se verá bajo la figura]</w:t>
-            </w:r>
-          </w:p>
-          <w:p>
-            <w:pPr>
-              <w:spacing w:after="40"/>
-            </w:pPr>
-            <w:r>
-              <w:rPr>
-                <w:b w:val="0"/>
-                <w:i w:val="0"/>
-                <w:color w:val="6E738C"/>
-                <w:sz w:val="21"/>
-              </w:rPr>
-              <w:t>[Qué debe dibujar el diseñador: elementos, orden y los textos que van dentro.]</w:t>
-            </w:r>
-          </w:p>
-          <w:p>
-            <w:pPr>
-              <w:spacing w:before="80" w:after="0"/>
-            </w:pPr>
-            <w:r>
-              <w:rPr>
-                <w:i/>
-                <w:color w:val="6E738C"/>
-                <w:sz w:val="18"/>
-              </w:rPr>
-              <w:t>Ámbar: va al diseñador gráfico. La caja se escribe en el punto exacto donde debe verse la figura: ahí la ubica producción.</w:t>
-            </w:r>
-          </w:p>
-        </w:tc>
-      </w:tr>
-    </w:tbl>
-    <w:p>
-      <w:pPr>
-        <w:spacing w:after="80"/>
-      </w:pPr>
-    </w:p>
-    <w:tbl>
-      <w:tblPr>
-        <w:tblW w:type="auto" w:w="0"/>
-        <w:jc w:val="left"/>
-        <w:tblLook w:firstColumn="1" w:firstRow="1" w:lastColumn="0" w:lastRow="0" w:noHBand="0" w:noVBand="1" w:val="04A0"/>
-      </w:tblPr>
-      <w:tblGrid>
-        <w:gridCol w:w="9518"/>
-      </w:tblGrid>
-      <w:tr>
-        <w:tc>
-          <w:tcPr>
-            <w:tcW w:type="dxa" w:w="9518"/>
-            <w:shd w:fill="F3F3F5"/>
-            <w:tcBorders>
-              <w:left w:val="single" w:sz="30" w:color="9A9EB0"/>
-              <w:top w:val="single" w:sz="6" w:color="F3F3F5"/>
-              <w:bottom w:val="single" w:sz="6" w:color="F3F3F5"/>
-              <w:right w:val="single" w:sz="6" w:color="F3F3F5"/>
-            </w:tcBorders>
-            <w:tcMar>
-              <w:top w:w="100" w:type="dxa"/>
-              <w:bottom w:w="100" w:type="dxa"/>
-              <w:left w:w="160" w:type="dxa"/>
-              <w:right w:w="160" w:type="dxa"/>
-            </w:tcMar>
-          </w:tcPr>
-          <w:p>
-            <w:pPr>
-              <w:spacing w:after="80"/>
-            </w:pPr>
-            <w:r/>
-            <w:r>
-              <w:rPr>
-                <w:b/>
-                <w:color w:val="5C6280"/>
-                <w:sz w:val="16"/>
-                <w:spacing w:val="30"/>
-              </w:rPr>
-              <w:t>NOTA PARA PRODUCCIÓN · NO SALE EN EL CURSO</w:t>
-            </w:r>
-          </w:p>
-          <w:p>
-            <w:pPr>
-              <w:spacing w:after="40"/>
-            </w:pPr>
-            <w:r>
-              <w:rPr>
-                <w:b w:val="0"/>
-                <w:i w:val="0"/>
-                <w:sz w:val="21"/>
-              </w:rPr>
-              <w:t>Aquí va una sugerencia para producción: un componente que parece adecuado, una duda, una advertencia.</w:t>
-            </w:r>
-          </w:p>
-        </w:tc>
-      </w:tr>
-    </w:tbl>
-    <w:p>
-      <w:pPr>
-        <w:spacing w:after="80"/>
-      </w:pPr>
     </w:p>
     <w:p>
       <w:pPr>
@@ -363,7 +70,172 @@
           <w:color w:val="6E738C"/>
           <w:sz w:val="19"/>
         </w:rPr>
-        <w:t>Gris: no sale en el curso. Producción puede no aplicarla, y lo dice.</w:t>
+        <w:t>Un fragmento de tema con las tres:</w:t>
+      </w:r>
+    </w:p>
+    <w:p>
+      <w:r>
+        <w:t>Vuelva al caso de Red Salud Wari. El tablero y el reporte informan cifras distintas del mismo mes.</w:t>
+      </w:r>
+    </w:p>
+    <w:p>
+      <w:pPr>
+        <w:spacing w:after="40"/>
+      </w:pPr>
+      <w:r>
+        <w:t>Importante</w:t>
+      </w:r>
+    </w:p>
+    <w:p>
+      <w:pPr>
+        <w:spacing w:after="160"/>
+      </w:pPr>
+      <w:r>
+        <w:rPr>
+          <w:b w:val="0"/>
+          <w:i w:val="0"/>
+          <w:sz w:val="22"/>
+        </w:rPr>
+        <w:t xml:space="preserve">La confusión más costosa consiste en </w:t>
+      </w:r>
+      <w:r>
+        <w:rPr>
+          <w:b/>
+          <w:i w:val="0"/>
+          <w:sz w:val="22"/>
+        </w:rPr>
+        <w:t>encargar el gobierno de datos al área de tecnología</w:t>
+      </w:r>
+      <w:r>
+        <w:rPr>
+          <w:b w:val="0"/>
+          <w:i w:val="0"/>
+          <w:sz w:val="22"/>
+        </w:rPr>
+        <w:t>.</w:t>
+      </w:r>
+    </w:p>
+    <w:p>
+      <w:pPr>
+        <w:spacing w:after="40"/>
+      </w:pPr>
+      <w:r>
+        <w:rPr>
+          <w:b/>
+          <w:color w:val="FF0000"/>
+        </w:rPr>
+        <w:t>Carrusel</w:t>
+      </w:r>
+    </w:p>
+    <w:p>
+      <w:pPr>
+        <w:spacing w:after="40"/>
+      </w:pPr>
+      <w:r>
+        <w:rPr>
+          <w:b/>
+          <w:i w:val="0"/>
+          <w:sz w:val="22"/>
+        </w:rPr>
+        <w:t xml:space="preserve">Título: </w:t>
+      </w:r>
+      <w:r>
+        <w:rPr>
+          <w:b w:val="0"/>
+          <w:i w:val="0"/>
+          <w:sz w:val="22"/>
+        </w:rPr>
+        <w:t>4 primeros roles del gobierno de datos</w:t>
+      </w:r>
+    </w:p>
+    <w:p>
+      <w:pPr>
+        <w:spacing w:after="0"/>
+      </w:pPr>
+      <w:r>
+        <w:rPr>
+          <w:b w:val="0"/>
+          <w:i w:val="0"/>
+          <w:sz w:val="22"/>
+        </w:rPr>
+        <w:t>Tarjeta 1</w:t>
+      </w:r>
+    </w:p>
+    <w:p>
+      <w:pPr>
+        <w:spacing w:after="0"/>
+      </w:pPr>
+      <w:r>
+        <w:rPr>
+          <w:b/>
+          <w:i w:val="0"/>
+          <w:sz w:val="22"/>
+        </w:rPr>
+        <w:t>El propietario del dominio</w:t>
+      </w:r>
+    </w:p>
+    <w:p>
+      <w:pPr>
+        <w:spacing w:after="120"/>
+      </w:pPr>
+      <w:r>
+        <w:rPr>
+          <w:b w:val="0"/>
+          <w:i w:val="0"/>
+          <w:sz w:val="22"/>
+        </w:rPr>
+        <w:t>Es quien responde por un conjunto de datos ante la organización.</w:t>
+      </w:r>
+    </w:p>
+    <w:p>
+      <w:pPr>
+        <w:spacing w:after="0"/>
+      </w:pPr>
+      <w:r>
+        <w:rPr>
+          <w:b w:val="0"/>
+          <w:i w:val="0"/>
+          <w:sz w:val="22"/>
+        </w:rPr>
+        <w:t>Tarjeta 2</w:t>
+      </w:r>
+    </w:p>
+    <w:p>
+      <w:pPr>
+        <w:spacing w:after="0"/>
+      </w:pPr>
+      <w:r>
+        <w:rPr>
+          <w:b/>
+          <w:i w:val="0"/>
+          <w:sz w:val="22"/>
+        </w:rPr>
+        <w:t>El custodio técnico</w:t>
+      </w:r>
+    </w:p>
+    <w:p>
+      <w:pPr>
+        <w:spacing w:after="120"/>
+      </w:pPr>
+      <w:r>
+        <w:rPr>
+          <w:b w:val="0"/>
+          <w:i w:val="0"/>
+          <w:sz w:val="22"/>
+        </w:rPr>
+        <w:t>Administra el sistema que almacena los datos y ejecuta los controles.</w:t>
+      </w:r>
+    </w:p>
+    <w:p>
+      <w:pPr>
+        <w:spacing w:after="200"/>
+      </w:pPr>
+      <w:r>
+        <w:rPr>
+          <w:b/>
+          <w:color w:val="FF0000"/>
+        </w:rPr>
+        <w:t>Vincular Imagen-02</w:t>
       </w:r>
     </w:p>
     <w:p>
@@ -371,7 +243,7 @@
         <w:pStyle w:val="Heading1"/>
       </w:pPr>
       <w:r>
-        <w:t>Cinco reglas</w:t>
+        <w:t>Seis reglas</w:t>
       </w:r>
     </w:p>
     <w:p>
@@ -393,7 +265,7 @@
           <w:i w:val="0"/>
           <w:sz w:val="22"/>
         </w:rPr>
-        <w:t xml:space="preserve"> Lo que va en negrilla aquí va en negrilla en el curso, y se verifica bloque por bloque.</w:t>
+        <w:t xml:space="preserve"> Lo que va en negrilla aquí va en negrilla en el curso, y se verifica tramo por tramo. Una por frase.</w:t>
       </w:r>
     </w:p>
     <w:p>
@@ -407,7 +279,7 @@
           <w:i w:val="0"/>
           <w:sz w:val="22"/>
         </w:rPr>
-        <w:t>El título del componente es opcional.</w:t>
+        <w:t>El nombre del componente va en rojo, en su propia línea.</w:t>
       </w:r>
       <w:r>
         <w:rPr>
@@ -415,7 +287,7 @@
           <w:i w:val="0"/>
           <w:sz w:val="22"/>
         </w:rPr>
-        <w:t xml:space="preserve"> Va después del rótulo cuando el bloque tiene uno: «Acordeón: Las tres preguntas del criterio». Si el bloque nace dentro de un texto y no tiene título propio, se escribe solo «Acordeón:» y producción no inventa ninguno.</w:t>
+        <w:t xml:space="preserve"> Acordeón, Carrusel, Pestañas, Pasos, Pasos con detalle, Comparativo, Puntos de interés, Ventana de detalle, Banner destacado, Cifra destacada, Cita, Infografía, Ciclo, Línea de tiempo. Si dice Carrusel, sale carrusel.</w:t>
       </w:r>
     </w:p>
     <w:p>
@@ -429,7 +301,7 @@
           <w:i w:val="0"/>
           <w:sz w:val="22"/>
         </w:rPr>
-        <w:t>No se numera a mano lo que ya es una lista.</w:t>
+        <w:t>«Título:» debajo, si el bloque lo tiene.</w:t>
       </w:r>
       <w:r>
         <w:rPr>
@@ -437,7 +309,7 @@
           <w:i w:val="0"/>
           <w:sz w:val="22"/>
         </w:rPr>
-        <w:t xml:space="preserve"> «Paso 1», «Condición 2»: el número lo pone el componente.</w:t>
+        <w:t xml:space="preserve"> Es lo que el estudiante lee encima del componente. Sin título, no se escribe la línea y producción no inventa ninguno.</w:t>
       </w:r>
     </w:p>
     <w:p>
@@ -451,7 +323,7 @@
           <w:i w:val="0"/>
           <w:sz w:val="22"/>
         </w:rPr>
-        <w:t>Cada tema es una pantalla.</w:t>
+        <w:t>Cada parte en tres líneas.</w:t>
       </w:r>
       <w:r>
         <w:rPr>
@@ -459,7 +331,7 @@
           <w:i w:val="0"/>
           <w:sz w:val="22"/>
         </w:rPr>
-        <w:t xml:space="preserve"> Los subtemas (3.1, 3.2) son secciones dentro de esa pantalla.</w:t>
+        <w:t xml:space="preserve"> La línea «Ítem 1», «Tarjeta 1», «Pestaña 1», «Paso 1» o «Punto 1»; debajo, el título de la parte en negrilla; debajo, su texto. El número lo pone el componente. Un «Tip:» va en su propia línea.</w:t>
       </w:r>
     </w:p>
     <w:p>
@@ -473,7 +345,7 @@
           <w:i w:val="0"/>
           <w:sz w:val="22"/>
         </w:rPr>
-        <w:t>Sin caja, decide producción.</w:t>
+        <w:t>Las imágenes se vinculan por número.</w:t>
       </w:r>
       <w:r>
         <w:rPr>
@@ -481,7 +353,29 @@
           <w:i w:val="0"/>
           <w:sz w:val="22"/>
         </w:rPr>
-        <w:t xml:space="preserve"> Un bloque sin componente se resuelve con el catálogo y se declara como capa editorial, que ustedes validan.</w:t>
+        <w:t xml:space="preserve"> «Vincular Imagen-N» en el sitio exacto, y el archivo en PNG con ese nombre en la carpeta Imagenes. Igual el video («Vincular video» + enlace), el audio («Vincular audio» + MP3) y el PDF («Vincular PDF1»).</w:t>
+      </w:r>
+    </w:p>
+    <w:p>
+      <w:pPr>
+        <w:pStyle w:val="ListBullet"/>
+        <w:spacing w:after="80"/>
+      </w:pPr>
+      <w:r>
+        <w:rPr>
+          <w:b/>
+          <w:i w:val="0"/>
+          <w:sz w:val="22"/>
+        </w:rPr>
+        <w:t>Sin nombre, decide producción.</w:t>
+      </w:r>
+      <w:r>
+        <w:rPr>
+          <w:b w:val="0"/>
+          <w:i w:val="0"/>
+          <w:sz w:val="22"/>
+        </w:rPr>
+        <w:t xml:space="preserve"> Un bloque sin componente se resuelve con el catálogo y queda en la lista de capa editorial, que ustedes aprueban. Si producción quiere cambiar un componente que el Word sí nombra, lo pregunta antes.</w:t>
       </w:r>
     </w:p>
     <w:p>
@@ -604,7 +498,7 @@
                 <w:i w:val="0"/>
                 <w:sz w:val="20"/>
               </w:rPr>
-              <w:t>El banco de preguntas de la evaluación.</w:t>
+              <w:t>El banco de preguntas de la evaluación: «Pregunta N · Tema N», contexto, enunciado, opciones con la correcta marcada, acierto y error.</w:t>
             </w:r>
           </w:p>
         </w:tc>
@@ -622,7 +516,7 @@
                 <w:i w:val="0"/>
                 <w:sz w:val="20"/>
               </w:rPr>
-              <w:t>Glosario_Unidad.docx</w:t>
+              <w:t>Imagenes/</w:t>
             </w:r>
           </w:p>
         </w:tc>
@@ -638,7 +532,7 @@
                 <w:i w:val="0"/>
                 <w:sz w:val="20"/>
               </w:rPr>
-              <w:t>Los términos de la unidad con su definición.</w:t>
+              <w:t>Las imágenes en PNG, con el número del documento: Imagen-01.png, Imagen-02.png… La de portada, cuadrada (1400 × 1400), con la persona centrada y con licencia.</w:t>
             </w:r>
           </w:p>
         </w:tc>
@@ -656,7 +550,7 @@
                 <w:i w:val="0"/>
                 <w:sz w:val="20"/>
               </w:rPr>
-              <w:t>figuras/</w:t>
+              <w:t>PDF/</w:t>
             </w:r>
           </w:p>
         </w:tc>
@@ -672,7 +566,7 @@
                 <w:i w:val="0"/>
                 <w:sz w:val="20"/>
               </w:rPr>
-              <w:t>Las figuras del diseñador, numeradas en el orden en que este documento las menciona.</w:t>
+              <w:t>Los PDF vinculados, con su número: PDF1.pdf, PDF2.pdf…</w:t>
             </w:r>
           </w:p>
         </w:tc>
@@ -690,7 +584,7 @@
                 <w:i w:val="0"/>
                 <w:sz w:val="20"/>
               </w:rPr>
-              <w:t>media/</w:t>
+              <w:t>Audio y video propios</w:t>
             </w:r>
           </w:p>
         </w:tc>
@@ -706,7 +600,7 @@
                 <w:i w:val="0"/>
                 <w:sz w:val="20"/>
               </w:rPr>
-              <w:t>El video y el pódcast, con su duración real declarada aquí.</w:t>
+              <w:t>Los MP3 y MP4 que el documento vincule por nombre. Los de YouTube o Vimeo van solo con el enlace.</w:t>
             </w:r>
           </w:p>
         </w:tc>
@@ -727,7 +621,7 @@
           <w:i w:val="0"/>
           <w:sz w:val="20"/>
         </w:rPr>
-        <w:t xml:space="preserve">Cada componente y sus campos, con un ejemplo funcionando: </w:t>
+        <w:t xml:space="preserve">Cada componente, cómo se escribe y un ejemplo funcionando: </w:t>
       </w:r>
       <w:r>
         <w:rPr>
@@ -756,410 +650,631 @@
         <w:pStyle w:val="Heading1"/>
       </w:pPr>
       <w:r>
-        <w:t>Ficha de la unidad</w:t>
+        <w:t>Portada</w:t>
       </w:r>
     </w:p>
-    <w:tbl>
-      <w:tblPr>
-        <w:tblStyle w:val="TableGrid"/>
-        <w:tblW w:type="auto" w:w="0"/>
-        <w:jc w:val="left"/>
-        <w:tblLook w:firstColumn="1" w:firstRow="1" w:lastColumn="0" w:lastRow="0" w:noHBand="0" w:noVBand="1" w:val="04A0"/>
-      </w:tblPr>
-      <w:tblGrid>
-        <w:gridCol w:w="4759"/>
-        <w:gridCol w:w="4759"/>
-      </w:tblGrid>
-      <w:tr>
-        <w:tc>
-          <w:tcPr>
-            <w:tcW w:type="dxa" w:w="2494"/>
-            <w:shd w:fill="EFECF7"/>
-          </w:tcPr>
-          <w:p>
-            <w:r/>
-            <w:r>
-              <w:rPr>
-                <w:b/>
-                <w:color w:val="503B96"/>
-                <w:sz w:val="16"/>
-                <w:spacing w:val="30"/>
-              </w:rPr>
-              <w:t>CAMPO</w:t>
-            </w:r>
-          </w:p>
-        </w:tc>
-        <w:tc>
-          <w:tcPr>
-            <w:tcW w:type="dxa" w:w="6803"/>
-            <w:shd w:fill="EFECF7"/>
-          </w:tcPr>
-          <w:p>
-            <w:r/>
-            <w:r>
-              <w:rPr>
-                <w:b/>
-                <w:color w:val="503B96"/>
-                <w:sz w:val="16"/>
-                <w:spacing w:val="30"/>
-              </w:rPr>
-              <w:t>CONTENIDO</w:t>
-            </w:r>
-          </w:p>
-        </w:tc>
-      </w:tr>
-      <w:tr>
-        <w:tc>
-          <w:tcPr>
-            <w:tcW w:type="dxa" w:w="2494"/>
-          </w:tcPr>
-          <w:p>
-            <w:r/>
-            <w:r>
-              <w:rPr>
-                <w:b w:val="0"/>
-                <w:i w:val="0"/>
-                <w:sz w:val="20"/>
-              </w:rPr>
-              <w:t>Curso</w:t>
-            </w:r>
-          </w:p>
-        </w:tc>
-        <w:tc>
-          <w:tcPr>
-            <w:tcW w:type="dxa" w:w="6803"/>
-          </w:tcPr>
-          <w:p>
-            <w:r/>
-            <w:r>
-              <w:rPr>
-                <w:b w:val="0"/>
-                <w:i w:val="0"/>
-                <w:color w:val="6E738C"/>
-                <w:sz w:val="20"/>
-              </w:rPr>
-              <w:t>[nombre del curso]</w:t>
-            </w:r>
-          </w:p>
-        </w:tc>
-      </w:tr>
-      <w:tr>
-        <w:tc>
-          <w:tcPr>
-            <w:tcW w:type="dxa" w:w="2494"/>
-          </w:tcPr>
-          <w:p>
-            <w:r/>
-            <w:r>
-              <w:rPr>
-                <w:b w:val="0"/>
-                <w:i w:val="0"/>
-                <w:sz w:val="20"/>
-              </w:rPr>
-              <w:t>Unidad</w:t>
-            </w:r>
-          </w:p>
-        </w:tc>
-        <w:tc>
-          <w:tcPr>
-            <w:tcW w:type="dxa" w:w="6803"/>
-          </w:tcPr>
-          <w:p>
-            <w:r/>
-            <w:r>
-              <w:rPr>
-                <w:b w:val="0"/>
-                <w:i w:val="0"/>
-                <w:color w:val="6E738C"/>
-                <w:sz w:val="20"/>
-              </w:rPr>
-              <w:t>[número y título]</w:t>
-            </w:r>
-          </w:p>
-        </w:tc>
-      </w:tr>
-      <w:tr>
-        <w:tc>
-          <w:tcPr>
-            <w:tcW w:type="dxa" w:w="2494"/>
-          </w:tcPr>
-          <w:p>
-            <w:r/>
-            <w:r>
-              <w:rPr>
-                <w:b w:val="0"/>
-                <w:i w:val="0"/>
-                <w:sz w:val="20"/>
-              </w:rPr>
-              <w:t>Objetivo</w:t>
-            </w:r>
-          </w:p>
-        </w:tc>
-        <w:tc>
-          <w:tcPr>
-            <w:tcW w:type="dxa" w:w="6803"/>
-          </w:tcPr>
-          <w:p>
-            <w:r/>
-            <w:r>
-              <w:rPr>
-                <w:b w:val="0"/>
-                <w:i w:val="0"/>
-                <w:color w:val="6E738C"/>
-                <w:sz w:val="20"/>
-              </w:rPr>
-              <w:t>[un párrafo; aparece en la portada y en la introducción]</w:t>
-            </w:r>
-          </w:p>
-        </w:tc>
-      </w:tr>
-      <w:tr>
-        <w:tc>
-          <w:tcPr>
-            <w:tcW w:type="dxa" w:w="2494"/>
-          </w:tcPr>
-          <w:p>
-            <w:r/>
-            <w:r>
-              <w:rPr>
-                <w:b w:val="0"/>
-                <w:i w:val="0"/>
-                <w:sz w:val="20"/>
-              </w:rPr>
-              <w:t>Público objetivo</w:t>
-            </w:r>
-          </w:p>
-        </w:tc>
-        <w:tc>
-          <w:tcPr>
-            <w:tcW w:type="dxa" w:w="6803"/>
-          </w:tcPr>
-          <w:p>
-            <w:r/>
-            <w:r>
-              <w:rPr>
-                <w:b w:val="0"/>
-                <w:i w:val="0"/>
-                <w:color w:val="6E738C"/>
-                <w:sz w:val="20"/>
-              </w:rPr>
-              <w:t>[a quién va dirigida, una o dos frases]</w:t>
-            </w:r>
-          </w:p>
-        </w:tc>
-      </w:tr>
-      <w:tr>
-        <w:tc>
-          <w:tcPr>
-            <w:tcW w:type="dxa" w:w="2494"/>
-          </w:tcPr>
-          <w:p>
-            <w:r/>
-            <w:r>
-              <w:rPr>
-                <w:b w:val="0"/>
-                <w:i w:val="0"/>
-                <w:sz w:val="20"/>
-              </w:rPr>
-              <w:t>Qué vas a aprender</w:t>
-            </w:r>
-          </w:p>
-        </w:tc>
-        <w:tc>
-          <w:tcPr>
-            <w:tcW w:type="dxa" w:w="6803"/>
-          </w:tcPr>
-          <w:p>
-            <w:r/>
-            <w:r>
-              <w:rPr>
-                <w:b w:val="0"/>
-                <w:i w:val="0"/>
-                <w:color w:val="6E738C"/>
-                <w:sz w:val="20"/>
-              </w:rPr>
-              <w:t>[un logro por línea, uno por tema]</w:t>
-            </w:r>
-          </w:p>
-        </w:tc>
-      </w:tr>
-    </w:tbl>
     <w:p>
       <w:pPr>
-        <w:spacing w:after="80"/>
+        <w:spacing w:after="40"/>
       </w:pPr>
+      <w:r>
+        <w:rPr>
+          <w:b/>
+          <w:i w:val="0"/>
+          <w:sz w:val="22"/>
+        </w:rPr>
+        <w:t xml:space="preserve">Unidad: </w:t>
+      </w:r>
+      <w:r>
+        <w:rPr>
+          <w:b w:val="0"/>
+          <w:i w:val="0"/>
+          <w:color w:val="6E738C"/>
+          <w:sz w:val="22"/>
+        </w:rPr>
+        <w:t>[número de la unidad]</w:t>
+      </w:r>
+    </w:p>
+    <w:p>
+      <w:pPr>
+        <w:spacing w:after="40"/>
+      </w:pPr>
+      <w:r>
+        <w:rPr>
+          <w:b/>
+          <w:i w:val="0"/>
+          <w:sz w:val="22"/>
+        </w:rPr>
+        <w:t xml:space="preserve">Título: </w:t>
+      </w:r>
+      <w:r>
+        <w:rPr>
+          <w:b w:val="0"/>
+          <w:i w:val="0"/>
+          <w:color w:val="6E738C"/>
+          <w:sz w:val="22"/>
+        </w:rPr>
+        <w:t>[título de la unidad; hasta 8 palabras]</w:t>
+      </w:r>
+    </w:p>
+    <w:p>
+      <w:pPr>
+        <w:spacing w:after="40"/>
+      </w:pPr>
+      <w:r>
+        <w:rPr>
+          <w:b/>
+          <w:i w:val="0"/>
+          <w:sz w:val="22"/>
+        </w:rPr>
+        <w:t xml:space="preserve">Subtítulo: </w:t>
+      </w:r>
+      <w:r>
+        <w:rPr>
+          <w:b w:val="0"/>
+          <w:i w:val="0"/>
+          <w:color w:val="6E738C"/>
+          <w:sz w:val="22"/>
+        </w:rPr>
+        <w:t>[la línea bajo el título: nombre del curso]</w:t>
+      </w:r>
+    </w:p>
+    <w:p>
+      <w:pPr>
+        <w:spacing w:after="40"/>
+      </w:pPr>
+      <w:r>
+        <w:rPr>
+          <w:b/>
+          <w:i w:val="0"/>
+          <w:sz w:val="22"/>
+        </w:rPr>
+        <w:t xml:space="preserve">Frase destacada: </w:t>
+      </w:r>
+      <w:r>
+        <w:rPr>
+          <w:b w:val="0"/>
+          <w:i w:val="0"/>
+          <w:color w:val="6E738C"/>
+          <w:sz w:val="22"/>
+        </w:rPr>
+        <w:t>[la frase que abre el curso; sale en la portada]</w:t>
+      </w:r>
+    </w:p>
+    <w:p>
+      <w:pPr>
+        <w:spacing w:after="40"/>
+      </w:pPr>
+      <w:r>
+        <w:rPr>
+          <w:b/>
+          <w:color w:val="FF0000"/>
+        </w:rPr>
+        <w:t>Vincular Imagen-01</w:t>
+      </w:r>
+    </w:p>
+    <w:p>
+      <w:pPr>
+        <w:spacing w:after="200"/>
+      </w:pPr>
+      <w:r>
+        <w:rPr>
+          <w:i/>
+          <w:color w:val="6E738C"/>
+          <w:sz w:val="19"/>
+        </w:rPr>
+        <w:t>La foto de portada, en Imagenes/Imagen-01.png: cuadrada, 1400 × 1400, con la persona centrada, con licencia. El énfasis del título lo decide producción.</w:t>
+      </w:r>
     </w:p>
     <w:p>
       <w:pPr>
         <w:pStyle w:val="Heading1"/>
       </w:pPr>
       <w:r>
-        <w:t>Portada</w:t>
+        <w:t>Contenido de la unidad</w:t>
       </w:r>
     </w:p>
-    <w:tbl>
-      <w:tblPr>
-        <w:tblW w:type="auto" w:w="0"/>
-        <w:jc w:val="left"/>
-        <w:tblLook w:firstColumn="1" w:firstRow="1" w:lastColumn="0" w:lastRow="0" w:noHBand="0" w:noVBand="1" w:val="04A0"/>
-      </w:tblPr>
-      <w:tblGrid>
-        <w:gridCol w:w="9518"/>
-      </w:tblGrid>
-      <w:tr>
-        <w:tc>
-          <w:tcPr>
-            <w:tcW w:type="dxa" w:w="9518"/>
-            <w:shd w:fill="EFECF7"/>
-            <w:tcBorders>
-              <w:left w:val="single" w:sz="30" w:color="503B96"/>
-              <w:top w:val="single" w:sz="6" w:color="EFECF7"/>
-              <w:bottom w:val="single" w:sz="6" w:color="EFECF7"/>
-              <w:right w:val="single" w:sz="6" w:color="EFECF7"/>
-            </w:tcBorders>
-            <w:tcMar>
-              <w:top w:w="100" w:type="dxa"/>
-              <w:bottom w:w="100" w:type="dxa"/>
-              <w:left w:w="160" w:type="dxa"/>
-              <w:right w:w="160" w:type="dxa"/>
-            </w:tcMar>
-          </w:tcPr>
-          <w:p>
-            <w:pPr>
-              <w:spacing w:after="80"/>
-            </w:pPr>
-            <w:r/>
-            <w:r>
-              <w:rPr>
-                <w:b/>
-                <w:color w:val="503B96"/>
-                <w:sz w:val="16"/>
-                <w:spacing w:val="30"/>
-              </w:rPr>
-              <w:t>COMPONENTE</w:t>
-            </w:r>
-          </w:p>
-          <w:p>
-            <w:pPr>
-              <w:spacing w:after="40"/>
-            </w:pPr>
-            <w:r>
-              <w:rPr>
-                <w:b/>
-                <w:i w:val="0"/>
-                <w:sz w:val="21"/>
-              </w:rPr>
-              <w:t>Portada</w:t>
-            </w:r>
-          </w:p>
-          <w:p>
-            <w:pPr>
-              <w:spacing w:after="40"/>
-            </w:pPr>
-            <w:r>
-              <w:rPr>
-                <w:b/>
-                <w:i w:val="0"/>
-                <w:sz w:val="21"/>
-              </w:rPr>
-              <w:t xml:space="preserve">Unidad: </w:t>
-            </w:r>
-            <w:r>
-              <w:rPr>
-                <w:b w:val="0"/>
-                <w:i w:val="0"/>
-                <w:color w:val="6E738C"/>
-                <w:sz w:val="21"/>
-              </w:rPr>
-              <w:t>[número de la unidad, como se ve arriba del título]</w:t>
-            </w:r>
-          </w:p>
-          <w:p>
-            <w:pPr>
-              <w:spacing w:after="40"/>
-            </w:pPr>
-            <w:r>
-              <w:rPr>
-                <w:b/>
-                <w:i w:val="0"/>
-                <w:sz w:val="21"/>
-              </w:rPr>
-              <w:t xml:space="preserve">Título: </w:t>
-            </w:r>
-            <w:r>
-              <w:rPr>
-                <w:b w:val="0"/>
-                <w:i w:val="0"/>
-                <w:color w:val="6E738C"/>
-                <w:sz w:val="21"/>
-              </w:rPr>
-              <w:t>[título de la unidad; hasta 8 palabras]</w:t>
-            </w:r>
-          </w:p>
-          <w:p>
-            <w:pPr>
-              <w:spacing w:after="40"/>
-            </w:pPr>
-            <w:r>
-              <w:rPr>
-                <w:b/>
-                <w:i w:val="0"/>
-                <w:sz w:val="21"/>
-              </w:rPr>
-              <w:t xml:space="preserve">Subtítulo: </w:t>
-            </w:r>
-            <w:r>
-              <w:rPr>
-                <w:b w:val="0"/>
-                <w:i w:val="0"/>
-                <w:color w:val="6E738C"/>
-                <w:sz w:val="21"/>
-              </w:rPr>
-              <w:t>[la línea bajo el título: nombre del curso o promesa de la unidad]</w:t>
-            </w:r>
-          </w:p>
-          <w:p>
-            <w:pPr>
-              <w:spacing w:after="40"/>
-            </w:pPr>
-            <w:r>
-              <w:rPr>
-                <w:b/>
-                <w:i w:val="0"/>
-                <w:sz w:val="21"/>
-              </w:rPr>
-              <w:t xml:space="preserve">Frase destacada: </w:t>
-            </w:r>
-            <w:r>
-              <w:rPr>
-                <w:b w:val="0"/>
-                <w:i w:val="0"/>
-                <w:color w:val="6E738C"/>
-                <w:sz w:val="21"/>
-              </w:rPr>
-              <w:t>[una o dos frases que abren el curso; salen en el recuadro de la portada]</w:t>
-            </w:r>
-          </w:p>
-          <w:p>
-            <w:pPr>
-              <w:spacing w:before="80" w:after="0"/>
-            </w:pPr>
-            <w:r>
-              <w:rPr>
-                <w:i/>
-                <w:color w:val="6E738C"/>
-                <w:sz w:val="18"/>
-              </w:rPr>
-              <w:t>El énfasis del título (la parte que va en cursiva) lo decide producción al maquetar. Si quieren una en particular, escríbanla en cursiva aquí y se respeta.</w:t>
-            </w:r>
-          </w:p>
-        </w:tc>
-      </w:tr>
-    </w:tbl>
     <w:p>
       <w:pPr>
-        <w:spacing w:after="80"/>
+        <w:spacing w:after="40"/>
       </w:pPr>
+      <w:r>
+        <w:t>Resultado de aprendizaje</w:t>
+      </w:r>
+    </w:p>
+    <w:p>
+      <w:r>
+        <w:t>[la frase que encabeza el índice]</w:t>
+      </w:r>
+    </w:p>
+    <w:p>
+      <w:pPr>
+        <w:spacing w:after="200"/>
+      </w:pPr>
+      <w:r>
+        <w:rPr>
+          <w:i/>
+          <w:color w:val="6E738C"/>
+          <w:sz w:val="19"/>
+        </w:rPr>
+        <w:t>El índice se arma solo con los títulos de los temas y sus secciones. Cada subtítulo debe poder leerse como una línea del índice.</w:t>
+      </w:r>
+    </w:p>
+    <w:p>
+      <w:pPr>
+        <w:pStyle w:val="Heading1"/>
+      </w:pPr>
+      <w:r>
+        <w:t>Introducción</w:t>
+      </w:r>
+    </w:p>
+    <w:p>
+      <w:pPr>
+        <w:spacing w:after="200"/>
+      </w:pPr>
+      <w:r>
+        <w:rPr>
+          <w:i/>
+          <w:color w:val="6E738C"/>
+          <w:sz w:val="19"/>
+        </w:rPr>
+        <w:t>Dos o tres párrafos sueltos: de qué trata la unidad, por qué importa y qué la hilvana. La primera frase es la que abre la pantalla.</w:t>
+      </w:r>
+    </w:p>
+    <w:p>
+      <w:r>
+        <w:t>[Primer párrafo de la introducción.]</w:t>
+      </w:r>
+    </w:p>
+    <w:p>
+      <w:r>
+        <w:t>[Segundo párrafo.]</w:t>
+      </w:r>
+    </w:p>
+    <w:p>
+      <w:pPr>
+        <w:pStyle w:val="Heading1"/>
+      </w:pPr>
+      <w:r>
+        <w:t>¿Qué va a lograr en esta unidad?</w:t>
+      </w:r>
+    </w:p>
+    <w:p>
+      <w:pPr>
+        <w:spacing w:after="40"/>
+      </w:pPr>
+      <w:r>
+        <w:t>Resultado de aprendizaje</w:t>
+      </w:r>
+    </w:p>
+    <w:p>
+      <w:r>
+        <w:t>[el mismo de «Contenido de la unidad»]</w:t>
+      </w:r>
+    </w:p>
+    <w:p>
+      <w:pPr>
+        <w:spacing w:after="40"/>
+      </w:pPr>
+      <w:r>
+        <w:t>Público objetivo</w:t>
+      </w:r>
+    </w:p>
+    <w:p>
+      <w:r>
+        <w:t>[a quién va dirigida, una o dos frases]</w:t>
+      </w:r>
+    </w:p>
+    <w:p>
+      <w:pPr>
+        <w:spacing w:after="40"/>
+      </w:pPr>
+      <w:r>
+        <w:t>¿Qué va a aprender?</w:t>
+      </w:r>
+    </w:p>
+    <w:p>
+      <w:r>
+        <w:t>[un párrafo]</w:t>
+      </w:r>
+    </w:p>
+    <w:p>
+      <w:pPr>
+        <w:spacing w:after="40"/>
+      </w:pPr>
+      <w:r>
+        <w:t>Evidencia de la unidad</w:t>
+      </w:r>
+    </w:p>
+    <w:p>
+      <w:r>
+        <w:t>[qué entrega el estudiante al terminar]</w:t>
+      </w:r>
+    </w:p>
+    <w:p>
+      <w:pPr>
+        <w:spacing w:after="200"/>
+      </w:pPr>
+      <w:r>
+        <w:rPr>
+          <w:i/>
+          <w:color w:val="6E738C"/>
+          <w:sz w:val="19"/>
+        </w:rPr>
+        <w:t>El reto de la unidad y el glosario, si los hay, van en el LMS: no se escriben aquí.</w:t>
+      </w:r>
+    </w:p>
+    <w:p>
+      <w:pPr>
+        <w:pStyle w:val="Heading1"/>
+      </w:pPr>
+      <w:r>
+        <w:t>1. [Título del tema]</w:t>
+      </w:r>
+    </w:p>
+    <w:p>
+      <w:r>
+        <w:t>[Entrada del tema: uno o dos párrafos. El primero es el propósito del tema.]</w:t>
+      </w:r>
+    </w:p>
+    <w:p>
+      <w:pPr>
+        <w:pStyle w:val="Heading2"/>
+      </w:pPr>
+      <w:r>
+        <w:t>1.1 [Título del subtema]</w:t>
+      </w:r>
+    </w:p>
+    <w:p>
+      <w:r>
+        <w:t>[Texto del subtema, completo: producción no recorta.]</w:t>
+      </w:r>
+    </w:p>
+    <w:p>
+      <w:pPr>
+        <w:spacing w:after="40"/>
+      </w:pPr>
+      <w:r>
+        <w:rPr>
+          <w:b/>
+          <w:color w:val="FF0000"/>
+        </w:rPr>
+        <w:t>Acordeón</w:t>
+      </w:r>
+    </w:p>
+    <w:p>
+      <w:pPr>
+        <w:spacing w:after="40"/>
+      </w:pPr>
+      <w:r>
+        <w:rPr>
+          <w:b/>
+          <w:i w:val="0"/>
+          <w:sz w:val="22"/>
+        </w:rPr>
+        <w:t xml:space="preserve">Título: </w:t>
+      </w:r>
+      <w:r>
+        <w:rPr>
+          <w:b w:val="0"/>
+          <w:i w:val="0"/>
+          <w:color w:val="6E738C"/>
+          <w:sz w:val="22"/>
+        </w:rPr>
+        <w:t>[título del acordeón]</w:t>
+      </w:r>
+    </w:p>
+    <w:p>
+      <w:pPr>
+        <w:spacing w:after="0"/>
+      </w:pPr>
+      <w:r>
+        <w:rPr>
+          <w:b w:val="0"/>
+          <w:i w:val="0"/>
+          <w:sz w:val="22"/>
+        </w:rPr>
+        <w:t>Ítem 1</w:t>
+      </w:r>
+    </w:p>
+    <w:p>
+      <w:pPr>
+        <w:spacing w:after="0"/>
+      </w:pPr>
+      <w:r>
+        <w:rPr>
+          <w:b/>
+          <w:i w:val="0"/>
+          <w:sz w:val="22"/>
+        </w:rPr>
+        <w:t>[título del ítem]</w:t>
+      </w:r>
+    </w:p>
+    <w:p>
+      <w:pPr>
+        <w:spacing w:after="120"/>
+      </w:pPr>
+      <w:r>
+        <w:rPr>
+          <w:b w:val="0"/>
+          <w:i w:val="0"/>
+          <w:color w:val="6E738C"/>
+          <w:sz w:val="22"/>
+        </w:rPr>
+        <w:t>[texto del ítem]</w:t>
+      </w:r>
+    </w:p>
+    <w:p>
+      <w:pPr>
+        <w:spacing w:after="0"/>
+      </w:pPr>
+      <w:r>
+        <w:rPr>
+          <w:b w:val="0"/>
+          <w:i w:val="0"/>
+          <w:sz w:val="22"/>
+        </w:rPr>
+        <w:t>Ítem 2</w:t>
+      </w:r>
+    </w:p>
+    <w:p>
+      <w:pPr>
+        <w:spacing w:after="0"/>
+      </w:pPr>
+      <w:r>
+        <w:rPr>
+          <w:b/>
+          <w:i w:val="0"/>
+          <w:sz w:val="22"/>
+        </w:rPr>
+        <w:t>[título del ítem]</w:t>
+      </w:r>
+    </w:p>
+    <w:p>
+      <w:pPr>
+        <w:spacing w:after="120"/>
+      </w:pPr>
+      <w:r>
+        <w:rPr>
+          <w:b w:val="0"/>
+          <w:i w:val="0"/>
+          <w:color w:val="6E738C"/>
+          <w:sz w:val="22"/>
+        </w:rPr>
+        <w:t>[texto del ítem]</w:t>
+      </w:r>
+    </w:p>
+    <w:p>
+      <w:pPr>
+        <w:spacing w:after="0"/>
+      </w:pPr>
+      <w:r>
+        <w:rPr>
+          <w:b w:val="0"/>
+          <w:i w:val="0"/>
+          <w:sz w:val="22"/>
+        </w:rPr>
+        <w:t>Ítem 3</w:t>
+      </w:r>
+    </w:p>
+    <w:p>
+      <w:pPr>
+        <w:spacing w:after="0"/>
+      </w:pPr>
+      <w:r>
+        <w:rPr>
+          <w:b/>
+          <w:i w:val="0"/>
+          <w:sz w:val="22"/>
+        </w:rPr>
+        <w:t>[título del ítem]</w:t>
+      </w:r>
+    </w:p>
+    <w:p>
+      <w:pPr>
+        <w:spacing w:after="120"/>
+      </w:pPr>
+      <w:r>
+        <w:rPr>
+          <w:b w:val="0"/>
+          <w:i w:val="0"/>
+          <w:color w:val="6E738C"/>
+          <w:sz w:val="22"/>
+        </w:rPr>
+        <w:t>[texto del ítem]</w:t>
+      </w:r>
+    </w:p>
+    <w:p>
+      <w:r>
+        <w:t>[El texto sigue después del componente, sin repetir lo que ya está dentro.]</w:t>
+      </w:r>
+    </w:p>
+    <w:p>
+      <w:pPr>
+        <w:spacing w:after="40"/>
+      </w:pPr>
+      <w:r>
+        <w:t>Importante</w:t>
+      </w:r>
+    </w:p>
+    <w:p>
+      <w:r>
+        <w:t>[la idea que debe retenerse; hasta 60 palabras, con su negrilla]</w:t>
+      </w:r>
+    </w:p>
+    <w:p>
+      <w:pPr>
+        <w:spacing w:after="200"/>
+      </w:pPr>
+      <w:r>
+        <w:rPr>
+          <w:i/>
+          <w:color w:val="6E738C"/>
+          <w:sz w:val="19"/>
+        </w:rPr>
+        <w:t>Rótulos que el estudiante lee: Idea clave · Importante · Para tener en cuenta · Clave de aplicación · Criterio de aceptación · Atención · Error frecuente · Para reflexionar · Ponte a prueba · Dato curioso.</w:t>
+      </w:r>
+    </w:p>
+    <w:p>
+      <w:pPr>
+        <w:spacing w:after="40"/>
+      </w:pPr>
+      <w:r>
+        <w:rPr>
+          <w:b/>
+          <w:color w:val="FF0000"/>
+        </w:rPr>
+        <w:t>Cifra destacada</w:t>
+      </w:r>
+    </w:p>
+    <w:p>
+      <w:pPr>
+        <w:spacing w:after="40"/>
+      </w:pPr>
+      <w:r>
+        <w:rPr>
+          <w:b/>
+          <w:i w:val="0"/>
+          <w:sz w:val="22"/>
+        </w:rPr>
+        <w:t xml:space="preserve">Título: </w:t>
+      </w:r>
+      <w:r>
+        <w:rPr>
+          <w:b w:val="0"/>
+          <w:i w:val="0"/>
+          <w:color w:val="6E738C"/>
+          <w:sz w:val="22"/>
+        </w:rPr>
+        <w:t>[rótulo que se lee encima del texto, p. ej. Dato con evidencia]</w:t>
+      </w:r>
+    </w:p>
+    <w:p>
+      <w:pPr>
+        <w:spacing w:after="40"/>
+      </w:pPr>
+      <w:r>
+        <w:rPr>
+          <w:b/>
+          <w:i w:val="0"/>
+          <w:sz w:val="22"/>
+        </w:rPr>
+        <w:t xml:space="preserve">Cifra: </w:t>
+      </w:r>
+      <w:r>
+        <w:rPr>
+          <w:b w:val="0"/>
+          <w:i w:val="0"/>
+          <w:color w:val="6E738C"/>
+          <w:sz w:val="22"/>
+        </w:rPr>
+        <w:t>[la cifra con su unidad]</w:t>
+      </w:r>
+    </w:p>
+    <w:p>
+      <w:pPr>
+        <w:spacing w:after="40"/>
+      </w:pPr>
+      <w:r>
+        <w:rPr>
+          <w:b/>
+          <w:i w:val="0"/>
+          <w:sz w:val="22"/>
+        </w:rPr>
+        <w:t xml:space="preserve">Rótulo: </w:t>
+      </w:r>
+      <w:r>
+        <w:rPr>
+          <w:b w:val="0"/>
+          <w:i w:val="0"/>
+          <w:color w:val="6E738C"/>
+          <w:sz w:val="22"/>
+        </w:rPr>
+        <w:t>[qué mide; hasta 12 palabras]</w:t>
+      </w:r>
+    </w:p>
+    <w:p>
+      <w:pPr>
+        <w:spacing w:after="40"/>
+      </w:pPr>
+      <w:r>
+        <w:rPr>
+          <w:b/>
+          <w:i w:val="0"/>
+          <w:sz w:val="22"/>
+        </w:rPr>
+        <w:t xml:space="preserve">Texto: </w:t>
+      </w:r>
+      <w:r>
+        <w:rPr>
+          <w:b w:val="0"/>
+          <w:i w:val="0"/>
+          <w:color w:val="6E738C"/>
+          <w:sz w:val="22"/>
+        </w:rPr>
+        <w:t>[el párrafo completo, literal]</w:t>
+      </w:r>
+    </w:p>
+    <w:p>
+      <w:pPr>
+        <w:spacing w:after="40"/>
+      </w:pPr>
+      <w:r>
+        <w:rPr>
+          <w:b/>
+          <w:i w:val="0"/>
+          <w:sz w:val="22"/>
+        </w:rPr>
+        <w:t xml:space="preserve">Fuente: </w:t>
+      </w:r>
+      <w:r>
+        <w:rPr>
+          <w:b w:val="0"/>
+          <w:i w:val="0"/>
+          <w:color w:val="6E738C"/>
+          <w:sz w:val="22"/>
+        </w:rPr>
+        <w:t>[referencia]</w:t>
+      </w:r>
+    </w:p>
+    <w:p>
+      <w:r>
+        <w:t>[Un párrafo que presenta la figura.]</w:t>
+      </w:r>
+    </w:p>
+    <w:p>
+      <w:pPr>
+        <w:spacing w:after="40"/>
+      </w:pPr>
+      <w:r>
+        <w:rPr>
+          <w:b/>
+          <w:color w:val="FF0000"/>
+        </w:rPr>
+        <w:t>Vincular Imagen-02</w:t>
+      </w:r>
+    </w:p>
+    <w:p>
+      <w:pPr>
+        <w:spacing w:after="40"/>
+      </w:pPr>
+      <w:r>
+        <w:rPr>
+          <w:b/>
+          <w:i w:val="0"/>
+          <w:sz w:val="22"/>
+        </w:rPr>
+        <w:t xml:space="preserve">Leyenda: </w:t>
+      </w:r>
+      <w:r>
+        <w:rPr>
+          <w:b w:val="0"/>
+          <w:i w:val="0"/>
+          <w:color w:val="6E738C"/>
+          <w:sz w:val="22"/>
+        </w:rPr>
+        <w:t>[pie de la imagen, literal; se borra la línea si no lleva]</w:t>
+      </w:r>
     </w:p>
     <w:tbl>
       <w:tblPr>
@@ -1213,1197 +1328,7 @@
                 <w:i w:val="0"/>
                 <w:sz w:val="21"/>
               </w:rPr>
-              <w:t>Figura de portada</w:t>
-            </w:r>
-          </w:p>
-          <w:p>
-            <w:pPr>
-              <w:spacing w:after="40"/>
-            </w:pPr>
-            <w:r>
-              <w:rPr>
-                <w:b/>
-                <w:i w:val="0"/>
-                <w:sz w:val="21"/>
-              </w:rPr>
-              <w:t xml:space="preserve">Leyenda: </w:t>
-            </w:r>
-            <w:r>
-              <w:rPr>
-                <w:b w:val="0"/>
-                <w:i w:val="0"/>
-                <w:color w:val="6E738C"/>
-                <w:sz w:val="21"/>
-              </w:rPr>
-              <w:t>[sin leyenda]</w:t>
-            </w:r>
-          </w:p>
-          <w:p>
-            <w:pPr>
-              <w:spacing w:after="40"/>
-            </w:pPr>
-            <w:r>
-              <w:rPr>
-                <w:b w:val="0"/>
-                <w:i w:val="0"/>
-                <w:color w:val="6E738C"/>
-                <w:sz w:val="21"/>
-              </w:rPr>
-              <w:t>[Qué muestra la fotografía de portada: la escena, en clave alta, y quién aparece.]</w:t>
-            </w:r>
-          </w:p>
-          <w:p>
-            <w:pPr>
-              <w:spacing w:before="80" w:after="0"/>
-            </w:pPr>
-            <w:r>
-              <w:rPr>
-                <w:i/>
-                <w:color w:val="6E738C"/>
-                <w:sz w:val="18"/>
-              </w:rPr>
-              <w:t>La portada lleva foto, no ilustración: su lugar ya está fijado por el diseño de la pantalla. Si la foto ya está elegida, se nombra el archivo.</w:t>
-            </w:r>
-          </w:p>
-        </w:tc>
-      </w:tr>
-    </w:tbl>
-    <w:p>
-      <w:pPr>
-        <w:spacing w:after="80"/>
-      </w:pPr>
-    </w:p>
-    <w:p>
-      <w:pPr>
-        <w:pStyle w:val="Heading1"/>
-      </w:pPr>
-      <w:r>
-        <w:t>Contenido de la unidad</w:t>
-      </w:r>
-    </w:p>
-    <w:tbl>
-      <w:tblPr>
-        <w:tblW w:type="auto" w:w="0"/>
-        <w:jc w:val="left"/>
-        <w:tblLook w:firstColumn="1" w:firstRow="1" w:lastColumn="0" w:lastRow="0" w:noHBand="0" w:noVBand="1" w:val="04A0"/>
-      </w:tblPr>
-      <w:tblGrid>
-        <w:gridCol w:w="9518"/>
-      </w:tblGrid>
-      <w:tr>
-        <w:tc>
-          <w:tcPr>
-            <w:tcW w:type="dxa" w:w="9518"/>
-            <w:shd w:fill="EFECF7"/>
-            <w:tcBorders>
-              <w:left w:val="single" w:sz="30" w:color="503B96"/>
-              <w:top w:val="single" w:sz="6" w:color="EFECF7"/>
-              <w:bottom w:val="single" w:sz="6" w:color="EFECF7"/>
-              <w:right w:val="single" w:sz="6" w:color="EFECF7"/>
-            </w:tcBorders>
-            <w:tcMar>
-              <w:top w:w="100" w:type="dxa"/>
-              <w:bottom w:w="100" w:type="dxa"/>
-              <w:left w:w="160" w:type="dxa"/>
-              <w:right w:w="160" w:type="dxa"/>
-            </w:tcMar>
-          </w:tcPr>
-          <w:p>
-            <w:pPr>
-              <w:spacing w:after="80"/>
-            </w:pPr>
-            <w:r/>
-            <w:r>
-              <w:rPr>
-                <w:b/>
-                <w:color w:val="503B96"/>
-                <w:sz w:val="16"/>
-                <w:spacing w:val="30"/>
-              </w:rPr>
-              <w:t>COMPONENTE</w:t>
-            </w:r>
-          </w:p>
-          <w:p>
-            <w:pPr>
-              <w:spacing w:after="40"/>
-            </w:pPr>
-            <w:r>
-              <w:rPr>
-                <w:b/>
-                <w:i w:val="0"/>
-                <w:sz w:val="21"/>
-              </w:rPr>
-              <w:t>Contenido de la unidad</w:t>
-            </w:r>
-          </w:p>
-          <w:p>
-            <w:pPr>
-              <w:spacing w:after="40"/>
-            </w:pPr>
-            <w:r>
-              <w:rPr>
-                <w:b/>
-                <w:i w:val="0"/>
-                <w:sz w:val="21"/>
-              </w:rPr>
-              <w:t xml:space="preserve">Resultado de aprendizaje: </w:t>
-            </w:r>
-            <w:r>
-              <w:rPr>
-                <w:b w:val="0"/>
-                <w:i w:val="0"/>
-                <w:color w:val="6E738C"/>
-                <w:sz w:val="21"/>
-              </w:rPr>
-              <w:t>[la frase que encabeza el índice; suele ser el objetivo de la unidad]</w:t>
-            </w:r>
-          </w:p>
-          <w:p>
-            <w:pPr>
-              <w:spacing w:before="80" w:after="0"/>
-            </w:pPr>
-            <w:r>
-              <w:rPr>
-                <w:i/>
-                <w:color w:val="6E738C"/>
-                <w:sz w:val="18"/>
-              </w:rPr>
-              <w:t>El índice se arma solo con los títulos de las secciones de este documento. Por eso cada subtítulo debe poder leerse como una línea del índice.</w:t>
-            </w:r>
-          </w:p>
-        </w:tc>
-      </w:tr>
-    </w:tbl>
-    <w:p>
-      <w:pPr>
-        <w:spacing w:after="80"/>
-      </w:pPr>
-    </w:p>
-    <w:p>
-      <w:pPr>
-        <w:pStyle w:val="Heading1"/>
-      </w:pPr>
-      <w:r>
-        <w:t>Introducción</w:t>
-      </w:r>
-    </w:p>
-    <w:p>
-      <w:pPr>
-        <w:spacing w:after="200"/>
-      </w:pPr>
-      <w:r>
-        <w:rPr>
-          <w:i/>
-          <w:color w:val="6E738C"/>
-          <w:sz w:val="19"/>
-        </w:rPr>
-        <w:t>Los párrafos de apertura van aquí, sueltos: por qué importa la unidad y qué la hilvana.</w:t>
-      </w:r>
-    </w:p>
-    <w:p>
-      <w:r>
-        <w:t>[Primer párrafo de la introducción.]</w:t>
-      </w:r>
-    </w:p>
-    <w:p>
-      <w:r>
-        <w:t>[Segundo párrafo.]</w:t>
-      </w:r>
-    </w:p>
-    <w:tbl>
-      <w:tblPr>
-        <w:tblW w:type="auto" w:w="0"/>
-        <w:jc w:val="left"/>
-        <w:tblLook w:firstColumn="1" w:firstRow="1" w:lastColumn="0" w:lastRow="0" w:noHBand="0" w:noVBand="1" w:val="04A0"/>
-      </w:tblPr>
-      <w:tblGrid>
-        <w:gridCol w:w="9518"/>
-      </w:tblGrid>
-      <w:tr>
-        <w:tc>
-          <w:tcPr>
-            <w:tcW w:type="dxa" w:w="9518"/>
-            <w:shd w:fill="EFECF7"/>
-            <w:tcBorders>
-              <w:left w:val="single" w:sz="30" w:color="503B96"/>
-              <w:top w:val="single" w:sz="6" w:color="EFECF7"/>
-              <w:bottom w:val="single" w:sz="6" w:color="EFECF7"/>
-              <w:right w:val="single" w:sz="6" w:color="EFECF7"/>
-            </w:tcBorders>
-            <w:tcMar>
-              <w:top w:w="100" w:type="dxa"/>
-              <w:bottom w:w="100" w:type="dxa"/>
-              <w:left w:w="160" w:type="dxa"/>
-              <w:right w:w="160" w:type="dxa"/>
-            </w:tcMar>
-          </w:tcPr>
-          <w:p>
-            <w:pPr>
-              <w:spacing w:after="80"/>
-            </w:pPr>
-            <w:r/>
-            <w:r>
-              <w:rPr>
-                <w:b/>
-                <w:color w:val="503B96"/>
-                <w:sz w:val="16"/>
-                <w:spacing w:val="30"/>
-              </w:rPr>
-              <w:t>COMPONENTE</w:t>
-            </w:r>
-          </w:p>
-          <w:p>
-            <w:pPr>
-              <w:spacing w:after="40"/>
-            </w:pPr>
-            <w:r>
-              <w:rPr>
-                <w:b/>
-                <w:i w:val="0"/>
-                <w:sz w:val="21"/>
-              </w:rPr>
-              <w:t>Bloque destacado: [título]</w:t>
-            </w:r>
-          </w:p>
-          <w:p>
-            <w:pPr>
-              <w:spacing w:after="40"/>
-            </w:pPr>
-            <w:r>
-              <w:rPr>
-                <w:b/>
-                <w:i w:val="0"/>
-                <w:sz w:val="21"/>
-              </w:rPr>
-              <w:t xml:space="preserve">Etiqueta: </w:t>
-            </w:r>
-            <w:r>
-              <w:rPr>
-                <w:b w:val="0"/>
-                <w:i w:val="0"/>
-                <w:sz w:val="21"/>
-              </w:rPr>
-              <w:t>Idea clave</w:t>
-            </w:r>
-          </w:p>
-          <w:p>
-            <w:pPr>
-              <w:spacing w:after="40"/>
-            </w:pPr>
-            <w:r>
-              <w:rPr>
-                <w:b/>
-                <w:i w:val="0"/>
-                <w:sz w:val="21"/>
-              </w:rPr>
-              <w:t xml:space="preserve">Texto: </w:t>
-            </w:r>
-            <w:r>
-              <w:rPr>
-                <w:b w:val="0"/>
-                <w:i w:val="0"/>
-                <w:color w:val="6E738C"/>
-                <w:sz w:val="21"/>
-              </w:rPr>
-              <w:t>[la idea que debe sobrevivir a la lectura rápida; hasta 60 palabras]</w:t>
-            </w:r>
-          </w:p>
-          <w:p>
-            <w:pPr>
-              <w:spacing w:before="80" w:after="0"/>
-            </w:pPr>
-            <w:r>
-              <w:rPr>
-                <w:i/>
-                <w:color w:val="6E738C"/>
-                <w:sz w:val="18"/>
-              </w:rPr>
-              <w:t>Etiquetas disponibles: Idea clave · Clave de aplicación · Criterio de aceptación · Atención · Error frecuente · Para reflexionar.</w:t>
-            </w:r>
-          </w:p>
-        </w:tc>
-      </w:tr>
-    </w:tbl>
-    <w:p>
-      <w:pPr>
-        <w:spacing w:after="80"/>
-      </w:pPr>
-    </w:p>
-    <w:p>
-      <w:pPr>
-        <w:pStyle w:val="Heading2"/>
-      </w:pPr>
-      <w:r>
-        <w:t>[Título de la primera sección]</w:t>
-      </w:r>
-    </w:p>
-    <w:p>
-      <w:r>
-        <w:t>[Texto de la sección.]</w:t>
-      </w:r>
-    </w:p>
-    <w:tbl>
-      <w:tblPr>
-        <w:tblW w:type="auto" w:w="0"/>
-        <w:jc w:val="left"/>
-        <w:tblLook w:firstColumn="1" w:firstRow="1" w:lastColumn="0" w:lastRow="0" w:noHBand="0" w:noVBand="1" w:val="04A0"/>
-      </w:tblPr>
-      <w:tblGrid>
-        <w:gridCol w:w="9518"/>
-      </w:tblGrid>
-      <w:tr>
-        <w:tc>
-          <w:tcPr>
-            <w:tcW w:type="dxa" w:w="9518"/>
-            <w:shd w:fill="EFECF7"/>
-            <w:tcBorders>
-              <w:left w:val="single" w:sz="30" w:color="503B96"/>
-              <w:top w:val="single" w:sz="6" w:color="EFECF7"/>
-              <w:bottom w:val="single" w:sz="6" w:color="EFECF7"/>
-              <w:right w:val="single" w:sz="6" w:color="EFECF7"/>
-            </w:tcBorders>
-            <w:tcMar>
-              <w:top w:w="100" w:type="dxa"/>
-              <w:bottom w:w="100" w:type="dxa"/>
-              <w:left w:w="160" w:type="dxa"/>
-              <w:right w:w="160" w:type="dxa"/>
-            </w:tcMar>
-          </w:tcPr>
-          <w:p>
-            <w:pPr>
-              <w:spacing w:after="80"/>
-            </w:pPr>
-            <w:r/>
-            <w:r>
-              <w:rPr>
-                <w:b/>
-                <w:color w:val="503B96"/>
-                <w:sz w:val="16"/>
-                <w:spacing w:val="30"/>
-              </w:rPr>
-              <w:t>COMPONENTE</w:t>
-            </w:r>
-          </w:p>
-          <w:p>
-            <w:pPr>
-              <w:spacing w:after="40"/>
-            </w:pPr>
-            <w:r>
-              <w:rPr>
-                <w:b/>
-                <w:i w:val="0"/>
-                <w:sz w:val="21"/>
-              </w:rPr>
-              <w:t>Ciclo: [título]</w:t>
-            </w:r>
-          </w:p>
-          <w:p>
-            <w:pPr>
-              <w:spacing w:after="40"/>
-            </w:pPr>
-            <w:r>
-              <w:rPr>
-                <w:b/>
-                <w:i w:val="0"/>
-                <w:sz w:val="21"/>
-              </w:rPr>
-              <w:t xml:space="preserve">Paso: </w:t>
-            </w:r>
-            <w:r>
-              <w:rPr>
-                <w:b w:val="0"/>
-                <w:i w:val="0"/>
-                <w:color w:val="6E738C"/>
-                <w:sz w:val="21"/>
-              </w:rPr>
-              <w:t>[título] — [texto]</w:t>
-            </w:r>
-          </w:p>
-          <w:p>
-            <w:pPr>
-              <w:spacing w:after="40"/>
-            </w:pPr>
-            <w:r>
-              <w:rPr>
-                <w:b/>
-                <w:i w:val="0"/>
-                <w:sz w:val="21"/>
-              </w:rPr>
-              <w:t xml:space="preserve">Paso: </w:t>
-            </w:r>
-            <w:r>
-              <w:rPr>
-                <w:b w:val="0"/>
-                <w:i w:val="0"/>
-                <w:color w:val="6E738C"/>
-                <w:sz w:val="21"/>
-              </w:rPr>
-              <w:t>[título] — [texto]</w:t>
-            </w:r>
-          </w:p>
-          <w:p>
-            <w:pPr>
-              <w:spacing w:after="40"/>
-            </w:pPr>
-            <w:r>
-              <w:rPr>
-                <w:b/>
-                <w:i w:val="0"/>
-                <w:sz w:val="21"/>
-              </w:rPr>
-              <w:t xml:space="preserve">Paso: </w:t>
-            </w:r>
-            <w:r>
-              <w:rPr>
-                <w:b w:val="0"/>
-                <w:i w:val="0"/>
-                <w:color w:val="6E738C"/>
-                <w:sz w:val="21"/>
-              </w:rPr>
-              <w:t>[título] — [texto]</w:t>
-            </w:r>
-          </w:p>
-          <w:p>
-            <w:pPr>
-              <w:spacing w:after="40"/>
-            </w:pPr>
-            <w:r>
-              <w:rPr>
-                <w:b/>
-                <w:i w:val="0"/>
-                <w:sz w:val="21"/>
-              </w:rPr>
-              <w:t xml:space="preserve">Paso: </w:t>
-            </w:r>
-            <w:r>
-              <w:rPr>
-                <w:b w:val="0"/>
-                <w:i w:val="0"/>
-                <w:color w:val="6E738C"/>
-                <w:sz w:val="21"/>
-              </w:rPr>
-              <w:t>[título] — [texto]</w:t>
-            </w:r>
-          </w:p>
-          <w:p>
-            <w:pPr>
-              <w:spacing w:before="80" w:after="0"/>
-            </w:pPr>
-            <w:r>
-              <w:rPr>
-                <w:i/>
-                <w:color w:val="6E738C"/>
-                <w:sz w:val="18"/>
-              </w:rPr>
-              <w:t>El ciclo se dibuja completo, con los cuatro pasos a la vista. Para un proceso que no vuelve al principio, «Recorrido de pasos».</w:t>
-            </w:r>
-          </w:p>
-        </w:tc>
-      </w:tr>
-    </w:tbl>
-    <w:p>
-      <w:pPr>
-        <w:spacing w:after="80"/>
-      </w:pPr>
-    </w:p>
-    <w:p>
-      <w:pPr>
-        <w:pStyle w:val="Heading1"/>
-      </w:pPr>
-      <w:r>
-        <w:t>Tema [N] · [título del tema]</w:t>
-      </w:r>
-    </w:p>
-    <w:tbl>
-      <w:tblPr>
-        <w:tblStyle w:val="TableGrid"/>
-        <w:tblW w:type="auto" w:w="0"/>
-        <w:jc w:val="left"/>
-        <w:tblLook w:firstColumn="1" w:firstRow="1" w:lastColumn="0" w:lastRow="0" w:noHBand="0" w:noVBand="1" w:val="04A0"/>
-      </w:tblPr>
-      <w:tblGrid>
-        <w:gridCol w:w="4759"/>
-        <w:gridCol w:w="4759"/>
-      </w:tblGrid>
-      <w:tr>
-        <w:tc>
-          <w:tcPr>
-            <w:tcW w:type="dxa" w:w="2494"/>
-            <w:shd w:fill="EFECF7"/>
-          </w:tcPr>
-          <w:p>
-            <w:r/>
-            <w:r>
-              <w:rPr>
-                <w:b/>
-                <w:color w:val="503B96"/>
-                <w:sz w:val="16"/>
-                <w:spacing w:val="30"/>
-              </w:rPr>
-              <w:t>CAMPO</w:t>
-            </w:r>
-          </w:p>
-        </w:tc>
-        <w:tc>
-          <w:tcPr>
-            <w:tcW w:type="dxa" w:w="6803"/>
-            <w:shd w:fill="EFECF7"/>
-          </w:tcPr>
-          <w:p>
-            <w:r/>
-            <w:r>
-              <w:rPr>
-                <w:b/>
-                <w:color w:val="503B96"/>
-                <w:sz w:val="16"/>
-                <w:spacing w:val="30"/>
-              </w:rPr>
-              <w:t>CONTENIDO</w:t>
-            </w:r>
-          </w:p>
-        </w:tc>
-      </w:tr>
-      <w:tr>
-        <w:tc>
-          <w:tcPr>
-            <w:tcW w:type="dxa" w:w="2494"/>
-          </w:tcPr>
-          <w:p>
-            <w:r/>
-            <w:r>
-              <w:rPr>
-                <w:b w:val="0"/>
-                <w:i w:val="0"/>
-                <w:sz w:val="20"/>
-              </w:rPr>
-              <w:t>Resultado / criterio</w:t>
-            </w:r>
-          </w:p>
-        </w:tc>
-        <w:tc>
-          <w:tcPr>
-            <w:tcW w:type="dxa" w:w="6803"/>
-          </w:tcPr>
-          <w:p>
-            <w:r/>
-            <w:r>
-              <w:rPr>
-                <w:b w:val="0"/>
-                <w:i w:val="0"/>
-                <w:color w:val="6E738C"/>
-                <w:sz w:val="20"/>
-              </w:rPr>
-              <w:t>[qué debe poder hacer el estudiante al terminar el tema]</w:t>
-            </w:r>
-          </w:p>
-        </w:tc>
-      </w:tr>
-      <w:tr>
-        <w:tc>
-          <w:tcPr>
-            <w:tcW w:type="dxa" w:w="2494"/>
-          </w:tcPr>
-          <w:p>
-            <w:r/>
-            <w:r>
-              <w:rPr>
-                <w:b w:val="0"/>
-                <w:i w:val="0"/>
-                <w:sz w:val="20"/>
-              </w:rPr>
-              <w:t>Propósito del tema</w:t>
-            </w:r>
-          </w:p>
-        </w:tc>
-        <w:tc>
-          <w:tcPr>
-            <w:tcW w:type="dxa" w:w="6803"/>
-          </w:tcPr>
-          <w:p>
-            <w:r/>
-            <w:r>
-              <w:rPr>
-                <w:b w:val="0"/>
-                <w:i w:val="0"/>
-                <w:color w:val="6E738C"/>
-                <w:sz w:val="20"/>
-              </w:rPr>
-              <w:t>[qué instala el tema, en una frase]</w:t>
-            </w:r>
-          </w:p>
-        </w:tc>
-      </w:tr>
-    </w:tbl>
-    <w:p>
-      <w:pPr>
-        <w:spacing w:after="80"/>
-      </w:pPr>
-    </w:p>
-    <w:p>
-      <w:r>
-        <w:t>[Entrada del tema: uno o dos párrafos.]</w:t>
-      </w:r>
-    </w:p>
-    <w:p>
-      <w:pPr>
-        <w:pStyle w:val="Heading2"/>
-      </w:pPr>
-      <w:r>
-        <w:t>[N].1 [título del subtema]</w:t>
-      </w:r>
-    </w:p>
-    <w:p>
-      <w:r>
-        <w:t>[Texto del subtema, completo: producción no recorta.]</w:t>
-      </w:r>
-    </w:p>
-    <w:tbl>
-      <w:tblPr>
-        <w:tblW w:type="auto" w:w="0"/>
-        <w:jc w:val="left"/>
-        <w:tblLook w:firstColumn="1" w:firstRow="1" w:lastColumn="0" w:lastRow="0" w:noHBand="0" w:noVBand="1" w:val="04A0"/>
-      </w:tblPr>
-      <w:tblGrid>
-        <w:gridCol w:w="9518"/>
-      </w:tblGrid>
-      <w:tr>
-        <w:tc>
-          <w:tcPr>
-            <w:tcW w:type="dxa" w:w="9518"/>
-            <w:shd w:fill="EFECF7"/>
-            <w:tcBorders>
-              <w:left w:val="single" w:sz="30" w:color="503B96"/>
-              <w:top w:val="single" w:sz="6" w:color="EFECF7"/>
-              <w:bottom w:val="single" w:sz="6" w:color="EFECF7"/>
-              <w:right w:val="single" w:sz="6" w:color="EFECF7"/>
-            </w:tcBorders>
-            <w:tcMar>
-              <w:top w:w="100" w:type="dxa"/>
-              <w:bottom w:w="100" w:type="dxa"/>
-              <w:left w:w="160" w:type="dxa"/>
-              <w:right w:w="160" w:type="dxa"/>
-            </w:tcMar>
-          </w:tcPr>
-          <w:p>
-            <w:pPr>
-              <w:spacing w:after="80"/>
-            </w:pPr>
-            <w:r/>
-            <w:r>
-              <w:rPr>
-                <w:b/>
-                <w:color w:val="503B96"/>
-                <w:sz w:val="16"/>
-                <w:spacing w:val="30"/>
-              </w:rPr>
-              <w:t>COMPONENTE</w:t>
-            </w:r>
-          </w:p>
-          <w:p>
-            <w:pPr>
-              <w:spacing w:after="40"/>
-            </w:pPr>
-            <w:r>
-              <w:rPr>
-                <w:b/>
-                <w:i w:val="0"/>
-                <w:sz w:val="21"/>
-              </w:rPr>
-              <w:t>Acordeón: [título]</w:t>
-            </w:r>
-          </w:p>
-          <w:p>
-            <w:pPr>
-              <w:spacing w:after="40"/>
-            </w:pPr>
-            <w:r>
-              <w:rPr>
-                <w:b/>
-                <w:i w:val="0"/>
-                <w:sz w:val="21"/>
-              </w:rPr>
-              <w:t xml:space="preserve">Ítem: </w:t>
-            </w:r>
-            <w:r>
-              <w:rPr>
-                <w:b w:val="0"/>
-                <w:i w:val="0"/>
-                <w:color w:val="6E738C"/>
-                <w:sz w:val="21"/>
-              </w:rPr>
-              <w:t>[título] — [texto]</w:t>
-            </w:r>
-          </w:p>
-          <w:p>
-            <w:pPr>
-              <w:spacing w:after="40"/>
-            </w:pPr>
-            <w:r>
-              <w:rPr>
-                <w:b/>
-                <w:i w:val="0"/>
-                <w:sz w:val="21"/>
-              </w:rPr>
-              <w:t xml:space="preserve">Ítem: </w:t>
-            </w:r>
-            <w:r>
-              <w:rPr>
-                <w:b w:val="0"/>
-                <w:i w:val="0"/>
-                <w:color w:val="6E738C"/>
-                <w:sz w:val="21"/>
-              </w:rPr>
-              <w:t>[título] — [texto]</w:t>
-            </w:r>
-          </w:p>
-          <w:p>
-            <w:pPr>
-              <w:spacing w:after="40"/>
-            </w:pPr>
-            <w:r>
-              <w:rPr>
-                <w:b/>
-                <w:i w:val="0"/>
-                <w:sz w:val="21"/>
-              </w:rPr>
-              <w:t xml:space="preserve">Ítem: </w:t>
-            </w:r>
-            <w:r>
-              <w:rPr>
-                <w:b w:val="0"/>
-                <w:i w:val="0"/>
-                <w:color w:val="6E738C"/>
-                <w:sz w:val="21"/>
-              </w:rPr>
-              <w:t>[título] — [texto]</w:t>
-            </w:r>
-          </w:p>
-          <w:p>
-            <w:pPr>
-              <w:spacing w:before="80" w:after="0"/>
-            </w:pPr>
-            <w:r>
-              <w:rPr>
-                <w:i/>
-                <w:color w:val="6E738C"/>
-                <w:sz w:val="18"/>
-              </w:rPr>
-              <w:t>De 3 a 8 ítems del mismo nivel.</w:t>
-            </w:r>
-          </w:p>
-        </w:tc>
-      </w:tr>
-    </w:tbl>
-    <w:p>
-      <w:pPr>
-        <w:spacing w:after="80"/>
-      </w:pPr>
-    </w:p>
-    <w:p>
-      <w:r>
-        <w:t>[El texto sigue después del componente, sin repetir lo que ya está dentro.]</w:t>
-      </w:r>
-    </w:p>
-    <w:tbl>
-      <w:tblPr>
-        <w:tblW w:type="auto" w:w="0"/>
-        <w:jc w:val="left"/>
-        <w:tblLook w:firstColumn="1" w:firstRow="1" w:lastColumn="0" w:lastRow="0" w:noHBand="0" w:noVBand="1" w:val="04A0"/>
-      </w:tblPr>
-      <w:tblGrid>
-        <w:gridCol w:w="9518"/>
-      </w:tblGrid>
-      <w:tr>
-        <w:tc>
-          <w:tcPr>
-            <w:tcW w:type="dxa" w:w="9518"/>
-            <w:shd w:fill="EFECF7"/>
-            <w:tcBorders>
-              <w:left w:val="single" w:sz="30" w:color="503B96"/>
-              <w:top w:val="single" w:sz="6" w:color="EFECF7"/>
-              <w:bottom w:val="single" w:sz="6" w:color="EFECF7"/>
-              <w:right w:val="single" w:sz="6" w:color="EFECF7"/>
-            </w:tcBorders>
-            <w:tcMar>
-              <w:top w:w="100" w:type="dxa"/>
-              <w:bottom w:w="100" w:type="dxa"/>
-              <w:left w:w="160" w:type="dxa"/>
-              <w:right w:w="160" w:type="dxa"/>
-            </w:tcMar>
-          </w:tcPr>
-          <w:p>
-            <w:pPr>
-              <w:spacing w:after="80"/>
-            </w:pPr>
-            <w:r/>
-            <w:r>
-              <w:rPr>
-                <w:b/>
-                <w:color w:val="503B96"/>
-                <w:sz w:val="16"/>
-                <w:spacing w:val="30"/>
-              </w:rPr>
-              <w:t>COMPONENTE</w:t>
-            </w:r>
-          </w:p>
-          <w:p>
-            <w:pPr>
-              <w:spacing w:after="40"/>
-            </w:pPr>
-            <w:r>
-              <w:rPr>
-                <w:b/>
-                <w:i w:val="0"/>
-                <w:sz w:val="21"/>
-              </w:rPr>
-              <w:t>Dato curioso en cifras: [título]</w:t>
-            </w:r>
-          </w:p>
-          <w:p>
-            <w:pPr>
-              <w:spacing w:after="40"/>
-            </w:pPr>
-            <w:r>
-              <w:rPr>
-                <w:b/>
-                <w:i w:val="0"/>
-                <w:sz w:val="21"/>
-              </w:rPr>
-              <w:t xml:space="preserve">Cifra: </w:t>
-            </w:r>
-            <w:r>
-              <w:rPr>
-                <w:b w:val="0"/>
-                <w:i w:val="0"/>
-                <w:color w:val="6E738C"/>
-                <w:sz w:val="21"/>
-              </w:rPr>
-              <w:t>[la cifra con su unidad]</w:t>
-            </w:r>
-          </w:p>
-          <w:p>
-            <w:pPr>
-              <w:spacing w:after="40"/>
-            </w:pPr>
-            <w:r>
-              <w:rPr>
-                <w:b/>
-                <w:i w:val="0"/>
-                <w:sz w:val="21"/>
-              </w:rPr>
-              <w:t xml:space="preserve">Rótulo: </w:t>
-            </w:r>
-            <w:r>
-              <w:rPr>
-                <w:b w:val="0"/>
-                <w:i w:val="0"/>
-                <w:color w:val="6E738C"/>
-                <w:sz w:val="21"/>
-              </w:rPr>
-              <w:t>[qué mide; hasta 12 palabras]</w:t>
-            </w:r>
-          </w:p>
-          <w:p>
-            <w:pPr>
-              <w:spacing w:after="40"/>
-            </w:pPr>
-            <w:r>
-              <w:rPr>
-                <w:b/>
-                <w:i w:val="0"/>
-                <w:sz w:val="21"/>
-              </w:rPr>
-              <w:t xml:space="preserve">Texto: </w:t>
-            </w:r>
-            <w:r>
-              <w:rPr>
-                <w:b w:val="0"/>
-                <w:i w:val="0"/>
-                <w:color w:val="6E738C"/>
-                <w:sz w:val="21"/>
-              </w:rPr>
-              <w:t>[el párrafo completo, literal]</w:t>
-            </w:r>
-          </w:p>
-          <w:p>
-            <w:pPr>
-              <w:spacing w:after="40"/>
-            </w:pPr>
-            <w:r>
-              <w:rPr>
-                <w:b/>
-                <w:i w:val="0"/>
-                <w:sz w:val="21"/>
-              </w:rPr>
-              <w:t xml:space="preserve">Fuente: </w:t>
-            </w:r>
-            <w:r>
-              <w:rPr>
-                <w:b w:val="0"/>
-                <w:i w:val="0"/>
-                <w:color w:val="6E738C"/>
-                <w:sz w:val="21"/>
-              </w:rPr>
-              <w:t>[referencia completa]</w:t>
-            </w:r>
-          </w:p>
-        </w:tc>
-      </w:tr>
-    </w:tbl>
-    <w:p>
-      <w:pPr>
-        <w:spacing w:after="80"/>
-      </w:pPr>
-    </w:p>
-    <w:tbl>
-      <w:tblPr>
-        <w:tblW w:type="auto" w:w="0"/>
-        <w:jc w:val="left"/>
-        <w:tblLook w:firstColumn="1" w:firstRow="1" w:lastColumn="0" w:lastRow="0" w:noHBand="0" w:noVBand="1" w:val="04A0"/>
-      </w:tblPr>
-      <w:tblGrid>
-        <w:gridCol w:w="9518"/>
-      </w:tblGrid>
-      <w:tr>
-        <w:tc>
-          <w:tcPr>
-            <w:tcW w:type="dxa" w:w="9518"/>
-            <w:shd w:fill="F3F3F5"/>
-            <w:tcBorders>
-              <w:left w:val="single" w:sz="30" w:color="9A9EB0"/>
-              <w:top w:val="single" w:sz="6" w:color="F3F3F5"/>
-              <w:bottom w:val="single" w:sz="6" w:color="F3F3F5"/>
-              <w:right w:val="single" w:sz="6" w:color="F3F3F5"/>
-            </w:tcBorders>
-            <w:tcMar>
-              <w:top w:w="100" w:type="dxa"/>
-              <w:bottom w:w="100" w:type="dxa"/>
-              <w:left w:w="160" w:type="dxa"/>
-              <w:right w:w="160" w:type="dxa"/>
-            </w:tcMar>
-          </w:tcPr>
-          <w:p>
-            <w:pPr>
-              <w:spacing w:after="80"/>
-            </w:pPr>
-            <w:r/>
-            <w:r>
-              <w:rPr>
-                <w:b/>
-                <w:color w:val="5C6280"/>
-                <w:sz w:val="16"/>
-                <w:spacing w:val="30"/>
-              </w:rPr>
-              <w:t>NOTA PARA PRODUCCIÓN · NO SALE EN EL CURSO</w:t>
-            </w:r>
-          </w:p>
-          <w:p>
-            <w:pPr>
-              <w:spacing w:after="40"/>
-            </w:pPr>
-            <w:r>
-              <w:rPr>
-                <w:b w:val="0"/>
-                <w:i w:val="0"/>
-                <w:sz w:val="21"/>
-              </w:rPr>
-              <w:t>[Si hay una sugerencia para producción, va aquí. Si no, se borra la caja.]</w:t>
-            </w:r>
-          </w:p>
-        </w:tc>
-      </w:tr>
-    </w:tbl>
-    <w:p>
-      <w:pPr>
-        <w:spacing w:after="80"/>
-      </w:pPr>
-    </w:p>
-    <w:p>
-      <w:pPr>
-        <w:pStyle w:val="Heading2"/>
-      </w:pPr>
-      <w:r>
-        <w:t>[N].2 [título del subtema]</w:t>
-      </w:r>
-    </w:p>
-    <w:p>
-      <w:r>
-        <w:t>[Texto del subtema.]</w:t>
-      </w:r>
-    </w:p>
-    <w:tbl>
-      <w:tblPr>
-        <w:tblW w:type="auto" w:w="0"/>
-        <w:jc w:val="left"/>
-        <w:tblLook w:firstColumn="1" w:firstRow="1" w:lastColumn="0" w:lastRow="0" w:noHBand="0" w:noVBand="1" w:val="04A0"/>
-      </w:tblPr>
-      <w:tblGrid>
-        <w:gridCol w:w="9518"/>
-      </w:tblGrid>
-      <w:tr>
-        <w:tc>
-          <w:tcPr>
-            <w:tcW w:type="dxa" w:w="9518"/>
-            <w:shd w:fill="EFECF7"/>
-            <w:tcBorders>
-              <w:left w:val="single" w:sz="30" w:color="503B96"/>
-              <w:top w:val="single" w:sz="6" w:color="EFECF7"/>
-              <w:bottom w:val="single" w:sz="6" w:color="EFECF7"/>
-              <w:right w:val="single" w:sz="6" w:color="EFECF7"/>
-            </w:tcBorders>
-            <w:tcMar>
-              <w:top w:w="100" w:type="dxa"/>
-              <w:bottom w:w="100" w:type="dxa"/>
-              <w:left w:w="160" w:type="dxa"/>
-              <w:right w:w="160" w:type="dxa"/>
-            </w:tcMar>
-          </w:tcPr>
-          <w:p>
-            <w:pPr>
-              <w:spacing w:after="80"/>
-            </w:pPr>
-            <w:r/>
-            <w:r>
-              <w:rPr>
-                <w:b/>
-                <w:color w:val="503B96"/>
-                <w:sz w:val="16"/>
-                <w:spacing w:val="30"/>
-              </w:rPr>
-              <w:t>COMPONENTE</w:t>
-            </w:r>
-          </w:p>
-          <w:p>
-            <w:pPr>
-              <w:spacing w:after="40"/>
-            </w:pPr>
-            <w:r>
-              <w:rPr>
-                <w:b/>
-                <w:i w:val="0"/>
-                <w:sz w:val="21"/>
-              </w:rPr>
-              <w:t>Comparativo: [qué se compara]</w:t>
-            </w:r>
-          </w:p>
-          <w:p>
-            <w:pPr>
-              <w:spacing w:after="40"/>
-            </w:pPr>
-            <w:r>
-              <w:rPr>
-                <w:b/>
-                <w:i w:val="0"/>
-                <w:sz w:val="21"/>
-              </w:rPr>
-              <w:t xml:space="preserve">[Lado A]: </w:t>
-            </w:r>
-            <w:r>
-              <w:rPr>
-                <w:b w:val="0"/>
-                <w:i w:val="0"/>
-                <w:color w:val="6E738C"/>
-                <w:sz w:val="21"/>
-              </w:rPr>
-              <w:t>[texto]</w:t>
-            </w:r>
-          </w:p>
-          <w:p>
-            <w:pPr>
-              <w:spacing w:after="40"/>
-            </w:pPr>
-            <w:r>
-              <w:rPr>
-                <w:b/>
-                <w:i w:val="0"/>
-                <w:sz w:val="21"/>
-              </w:rPr>
-              <w:t xml:space="preserve">[Lado B]: </w:t>
-            </w:r>
-            <w:r>
-              <w:rPr>
-                <w:b w:val="0"/>
-                <w:i w:val="0"/>
-                <w:color w:val="6E738C"/>
-                <w:sz w:val="21"/>
-              </w:rPr>
-              <w:t>[texto]</w:t>
-            </w:r>
-          </w:p>
-          <w:p>
-            <w:pPr>
-              <w:spacing w:before="80" w:after="0"/>
-            </w:pPr>
-            <w:r>
-              <w:rPr>
-                <w:i/>
-                <w:color w:val="6E738C"/>
-                <w:sz w:val="18"/>
-              </w:rPr>
-              <w:t>Para dos caminos opuestos. Con un caso concreto detrás, «Caso a dos vías».</w:t>
-            </w:r>
-          </w:p>
-        </w:tc>
-      </w:tr>
-    </w:tbl>
-    <w:p>
-      <w:pPr>
-        <w:spacing w:after="80"/>
-      </w:pPr>
-    </w:p>
-    <w:tbl>
-      <w:tblPr>
-        <w:tblW w:type="auto" w:w="0"/>
-        <w:jc w:val="left"/>
-        <w:tblLook w:firstColumn="1" w:firstRow="1" w:lastColumn="0" w:lastRow="0" w:noHBand="0" w:noVBand="1" w:val="04A0"/>
-      </w:tblPr>
-      <w:tblGrid>
-        <w:gridCol w:w="9518"/>
-      </w:tblGrid>
-      <w:tr>
-        <w:tc>
-          <w:tcPr>
-            <w:tcW w:type="dxa" w:w="9518"/>
-            <w:shd w:fill="FDF4DE"/>
-            <w:tcBorders>
-              <w:left w:val="single" w:sz="30" w:color="C08A00"/>
-              <w:top w:val="single" w:sz="6" w:color="FDF4DE"/>
-              <w:bottom w:val="single" w:sz="6" w:color="FDF4DE"/>
-              <w:right w:val="single" w:sz="6" w:color="FDF4DE"/>
-            </w:tcBorders>
-            <w:tcMar>
-              <w:top w:w="100" w:type="dxa"/>
-              <w:bottom w:w="100" w:type="dxa"/>
-              <w:left w:w="160" w:type="dxa"/>
-              <w:right w:w="160" w:type="dxa"/>
-            </w:tcMar>
-          </w:tcPr>
-          <w:p>
-            <w:pPr>
-              <w:spacing w:after="80"/>
-            </w:pPr>
-            <w:r/>
-            <w:r>
-              <w:rPr>
-                <w:b/>
-                <w:color w:val="8A6100"/>
-                <w:sz w:val="16"/>
-                <w:spacing w:val="30"/>
-              </w:rPr>
-              <w:t>PARA DISEÑO GRÁFICO · NO ES CONTENIDO</w:t>
-            </w:r>
-          </w:p>
-          <w:p>
-            <w:pPr>
-              <w:spacing w:after="40"/>
-            </w:pPr>
-            <w:r>
-              <w:rPr>
-                <w:b/>
-                <w:i w:val="0"/>
-                <w:sz w:val="21"/>
-              </w:rPr>
-              <w:t>Figura [N]</w:t>
+              <w:t>Figura 2</w:t>
             </w:r>
           </w:p>
           <w:p>
@@ -2439,7 +1364,7 @@
                 <w:color w:val="6E738C"/>
                 <w:sz w:val="21"/>
               </w:rPr>
-              <w:t>[Qué debe dibujar el diseñador.]</w:t>
+              <w:t>[Qué debe dibujar el diseñador: elementos, orden y los textos que van dentro.]</w:t>
             </w:r>
           </w:p>
           <w:p>
@@ -2452,7 +1377,7 @@
                 <w:color w:val="6E738C"/>
                 <w:sz w:val="18"/>
               </w:rPr>
-              <w:t>La figura se maqueta donde está esta caja: entre el párrafo de arriba y el de abajo. El número N es el del archivo que entrega el diseñador (figuras/figura-0N…), y se numera en el orden en que aparece en el documento.</w:t>
+              <w:t>Solo mientras la figura sigue en manos del diseñador: esta caja reemplaza a la línea «Vincular Imagen-2». Cuando llega el archivo, se quita la caja y queda la línea.</w:t>
             </w:r>
           </w:p>
         </w:tc>
@@ -2465,43 +1390,260 @@
     </w:p>
     <w:p>
       <w:pPr>
-        <w:pStyle w:val="Heading1"/>
+        <w:pStyle w:val="Heading2"/>
       </w:pPr>
       <w:r>
-        <w:t>Video de apoyo</w:t>
+        <w:t>1.2 [Título del subtema]</w:t>
+      </w:r>
+    </w:p>
+    <w:p>
+      <w:r>
+        <w:t>[Texto del subtema.]</w:t>
+      </w:r>
+    </w:p>
+    <w:p>
+      <w:pPr>
+        <w:spacing w:after="40"/>
+      </w:pPr>
+      <w:r>
+        <w:rPr>
+          <w:b/>
+          <w:color w:val="FF0000"/>
+        </w:rPr>
+        <w:t>Comparativo</w:t>
+      </w:r>
+    </w:p>
+    <w:p>
+      <w:pPr>
+        <w:spacing w:after="40"/>
+      </w:pPr>
+      <w:r>
+        <w:rPr>
+          <w:b/>
+          <w:i w:val="0"/>
+          <w:sz w:val="22"/>
+        </w:rPr>
+        <w:t xml:space="preserve">Título: </w:t>
+      </w:r>
+      <w:r>
+        <w:rPr>
+          <w:b w:val="0"/>
+          <w:i w:val="0"/>
+          <w:color w:val="6E738C"/>
+          <w:sz w:val="22"/>
+        </w:rPr>
+        <w:t>[qué se compara]</w:t>
+      </w:r>
+    </w:p>
+    <w:p>
+      <w:pPr>
+        <w:spacing w:after="0"/>
+      </w:pPr>
+      <w:r>
+        <w:rPr>
+          <w:b/>
+          <w:i w:val="0"/>
+          <w:sz w:val="22"/>
+        </w:rPr>
+        <w:t>[Lado A]</w:t>
+      </w:r>
+    </w:p>
+    <w:p>
+      <w:r>
+        <w:t>[texto del lado A]</w:t>
+      </w:r>
+    </w:p>
+    <w:p>
+      <w:pPr>
+        <w:spacing w:after="0"/>
+      </w:pPr>
+      <w:r>
+        <w:rPr>
+          <w:b/>
+          <w:i w:val="0"/>
+          <w:sz w:val="22"/>
+        </w:rPr>
+        <w:t>[Lado B]</w:t>
+      </w:r>
+    </w:p>
+    <w:p>
+      <w:r>
+        <w:t>[texto del lado B]</w:t>
+      </w:r>
+    </w:p>
+    <w:p>
+      <w:pPr>
+        <w:spacing w:after="40"/>
+      </w:pPr>
+      <w:r>
+        <w:rPr>
+          <w:b/>
+          <w:color w:val="FF0000"/>
+        </w:rPr>
+        <w:t>Pasos con detalle</w:t>
+      </w:r>
+    </w:p>
+    <w:p>
+      <w:pPr>
+        <w:spacing w:after="40"/>
+      </w:pPr>
+      <w:r>
+        <w:rPr>
+          <w:b/>
+          <w:i w:val="0"/>
+          <w:sz w:val="22"/>
+        </w:rPr>
+        <w:t xml:space="preserve">Título: </w:t>
+      </w:r>
+      <w:r>
+        <w:rPr>
+          <w:b w:val="0"/>
+          <w:i w:val="0"/>
+          <w:color w:val="6E738C"/>
+          <w:sz w:val="22"/>
+        </w:rPr>
+        <w:t>[título]</w:t>
+      </w:r>
+    </w:p>
+    <w:p>
+      <w:pPr>
+        <w:spacing w:after="0"/>
+      </w:pPr>
+      <w:r>
+        <w:rPr>
+          <w:b w:val="0"/>
+          <w:i w:val="0"/>
+          <w:sz w:val="22"/>
+        </w:rPr>
+        <w:t>Paso 1</w:t>
+      </w:r>
+    </w:p>
+    <w:p>
+      <w:pPr>
+        <w:spacing w:after="0"/>
+      </w:pPr>
+      <w:r>
+        <w:rPr>
+          <w:b/>
+          <w:i w:val="0"/>
+          <w:sz w:val="22"/>
+        </w:rPr>
+        <w:t>[título del paso]</w:t>
+      </w:r>
+    </w:p>
+    <w:p>
+      <w:pPr>
+        <w:spacing w:after="40"/>
+      </w:pPr>
+      <w:r>
+        <w:rPr>
+          <w:b w:val="0"/>
+          <w:i w:val="0"/>
+          <w:color w:val="6E738C"/>
+          <w:sz w:val="22"/>
+        </w:rPr>
+        <w:t>[texto]</w:t>
+      </w:r>
+    </w:p>
+    <w:p>
+      <w:pPr>
+        <w:spacing w:after="120"/>
+      </w:pPr>
+      <w:r>
+        <w:rPr>
+          <w:b/>
+          <w:i w:val="0"/>
+          <w:sz w:val="22"/>
+        </w:rPr>
+        <w:t xml:space="preserve">Tip: </w:t>
+      </w:r>
+      <w:r>
+        <w:rPr>
+          <w:b w:val="0"/>
+          <w:i w:val="0"/>
+          <w:color w:val="6E738C"/>
+          <w:sz w:val="22"/>
+        </w:rPr>
+        <w:t>[una línea, opcional]</w:t>
+      </w:r>
+    </w:p>
+    <w:p>
+      <w:pPr>
+        <w:spacing w:after="0"/>
+      </w:pPr>
+      <w:r>
+        <w:rPr>
+          <w:b w:val="0"/>
+          <w:i w:val="0"/>
+          <w:sz w:val="22"/>
+        </w:rPr>
+        <w:t>Paso 2</w:t>
+      </w:r>
+    </w:p>
+    <w:p>
+      <w:pPr>
+        <w:spacing w:after="0"/>
+      </w:pPr>
+      <w:r>
+        <w:rPr>
+          <w:b/>
+          <w:i w:val="0"/>
+          <w:sz w:val="22"/>
+        </w:rPr>
+        <w:t>[título del paso]</w:t>
+      </w:r>
+    </w:p>
+    <w:p>
+      <w:pPr>
+        <w:spacing w:after="120"/>
+      </w:pPr>
+      <w:r>
+        <w:rPr>
+          <w:b w:val="0"/>
+          <w:i w:val="0"/>
+          <w:color w:val="6E738C"/>
+          <w:sz w:val="22"/>
+        </w:rPr>
+        <w:t>[texto]</w:t>
+      </w:r>
+    </w:p>
+    <w:p>
+      <w:pPr>
+        <w:spacing w:after="0"/>
+      </w:pPr>
+      <w:r>
+        <w:rPr>
+          <w:b/>
+          <w:i w:val="0"/>
+          <w:sz w:val="22"/>
+        </w:rPr>
+        <w:t>Tabla 1</w:t>
+      </w:r>
+    </w:p>
+    <w:p>
+      <w:r>
+        <w:t>[Título de la tabla]</w:t>
       </w:r>
     </w:p>
     <w:tbl>
       <w:tblPr>
+        <w:tblStyle w:val="TableGrid"/>
         <w:tblW w:type="auto" w:w="0"/>
         <w:jc w:val="left"/>
         <w:tblLook w:firstColumn="1" w:firstRow="1" w:lastColumn="0" w:lastRow="0" w:noHBand="0" w:noVBand="1" w:val="04A0"/>
       </w:tblPr>
       <w:tblGrid>
-        <w:gridCol w:w="9518"/>
+        <w:gridCol w:w="3173"/>
+        <w:gridCol w:w="3173"/>
+        <w:gridCol w:w="3173"/>
       </w:tblGrid>
       <w:tr>
         <w:tc>
           <w:tcPr>
-            <w:tcW w:type="dxa" w:w="9518"/>
+            <w:tcW w:type="dxa" w:w="3061"/>
             <w:shd w:fill="EFECF7"/>
-            <w:tcBorders>
-              <w:left w:val="single" w:sz="30" w:color="503B96"/>
-              <w:top w:val="single" w:sz="6" w:color="EFECF7"/>
-              <w:bottom w:val="single" w:sz="6" w:color="EFECF7"/>
-              <w:right w:val="single" w:sz="6" w:color="EFECF7"/>
-            </w:tcBorders>
-            <w:tcMar>
-              <w:top w:w="100" w:type="dxa"/>
-              <w:bottom w:w="100" w:type="dxa"/>
-              <w:left w:w="160" w:type="dxa"/>
-              <w:right w:w="160" w:type="dxa"/>
-            </w:tcMar>
           </w:tcPr>
           <w:p>
-            <w:pPr>
-              <w:spacing w:after="80"/>
-            </w:pPr>
             <w:r/>
             <w:r>
               <w:rPr>
@@ -2510,143 +1652,143 @@
                 <w:sz w:val="16"/>
                 <w:spacing w:val="30"/>
               </w:rPr>
-              <w:t>COMPONENTE</w:t>
+              <w:t>[ENCABEZADO]</w:t>
             </w:r>
           </w:p>
+        </w:tc>
+        <w:tc>
+          <w:tcPr>
+            <w:tcW w:type="dxa" w:w="3118"/>
+            <w:shd w:fill="EFECF7"/>
+          </w:tcPr>
           <w:p>
-            <w:pPr>
-              <w:spacing w:after="40"/>
-            </w:pPr>
+            <w:r/>
             <w:r>
               <w:rPr>
                 <w:b/>
-                <w:i w:val="0"/>
-                <w:sz w:val="21"/>
+                <w:color w:val="503B96"/>
+                <w:sz w:val="16"/>
+                <w:spacing w:val="30"/>
               </w:rPr>
-              <w:t>Video de apoyo: [título]</w:t>
+              <w:t>[ENCABEZADO]</w:t>
             </w:r>
           </w:p>
+        </w:tc>
+        <w:tc>
+          <w:tcPr>
+            <w:tcW w:type="dxa" w:w="3118"/>
+            <w:shd w:fill="EFECF7"/>
+          </w:tcPr>
           <w:p>
-            <w:pPr>
-              <w:spacing w:after="40"/>
-            </w:pPr>
+            <w:r/>
             <w:r>
               <w:rPr>
                 <w:b/>
-                <w:i w:val="0"/>
-                <w:sz w:val="21"/>
+                <w:color w:val="503B96"/>
+                <w:sz w:val="16"/>
+                <w:spacing w:val="30"/>
               </w:rPr>
-              <w:t xml:space="preserve">Duración: </w:t>
+              <w:t>[ENCABEZADO]</w:t>
             </w:r>
+          </w:p>
+        </w:tc>
+      </w:tr>
+      <w:tr>
+        <w:tc>
+          <w:tcPr>
+            <w:tcW w:type="dxa" w:w="3061"/>
+          </w:tcPr>
+          <w:p>
+            <w:r/>
             <w:r>
               <w:rPr>
                 <w:b w:val="0"/>
                 <w:i w:val="0"/>
-                <w:color w:val="6E738C"/>
-                <w:sz w:val="21"/>
+                <w:sz w:val="20"/>
               </w:rPr>
-              <w:t>[minutos y segundos reales del archivo]</w:t>
+              <w:t>[celda]</w:t>
             </w:r>
           </w:p>
+        </w:tc>
+        <w:tc>
+          <w:tcPr>
+            <w:tcW w:type="dxa" w:w="3118"/>
+          </w:tcPr>
           <w:p>
-            <w:pPr>
-              <w:spacing w:after="40"/>
-            </w:pPr>
-            <w:r>
-              <w:rPr>
-                <w:b/>
-                <w:i w:val="0"/>
-                <w:sz w:val="21"/>
-              </w:rPr>
-              <w:t xml:space="preserve">Qué muestra: </w:t>
-            </w:r>
+            <w:r/>
             <w:r>
               <w:rPr>
                 <w:b w:val="0"/>
                 <w:i w:val="0"/>
-                <w:color w:val="6E738C"/>
-                <w:sz w:val="21"/>
+                <w:sz w:val="20"/>
               </w:rPr>
-              <w:t>[dos o tres frases; sale como texto de apoyo]</w:t>
+              <w:t>[celda]</w:t>
             </w:r>
           </w:p>
+        </w:tc>
+        <w:tc>
+          <w:tcPr>
+            <w:tcW w:type="dxa" w:w="3118"/>
+          </w:tcPr>
           <w:p>
-            <w:pPr>
-              <w:spacing w:after="40"/>
-            </w:pPr>
-            <w:r>
-              <w:rPr>
-                <w:b/>
-                <w:i w:val="0"/>
-                <w:sz w:val="21"/>
-              </w:rPr>
-              <w:t xml:space="preserve">Enlace: </w:t>
-            </w:r>
+            <w:r/>
             <w:r>
               <w:rPr>
                 <w:b w:val="0"/>
                 <w:i w:val="0"/>
-                <w:color w:val="6E738C"/>
-                <w:sz w:val="21"/>
+                <w:sz w:val="20"/>
               </w:rPr>
-              <w:t>[archivo en media/ o URL]</w:t>
+              <w:t>[celda]</w:t>
             </w:r>
           </w:p>
+        </w:tc>
+      </w:tr>
+      <w:tr>
+        <w:tc>
+          <w:tcPr>
+            <w:tcW w:type="dxa" w:w="3061"/>
+          </w:tcPr>
           <w:p>
-            <w:pPr>
-              <w:spacing w:after="40"/>
-            </w:pPr>
-            <w:r>
-              <w:rPr>
-                <w:b/>
-                <w:i w:val="0"/>
-                <w:sz w:val="21"/>
-              </w:rPr>
-              <w:t xml:space="preserve">Licencia: </w:t>
-            </w:r>
+            <w:r/>
             <w:r>
               <w:rPr>
                 <w:b w:val="0"/>
                 <w:i w:val="0"/>
-                <w:color w:val="6E738C"/>
-                <w:sz w:val="21"/>
+                <w:sz w:val="20"/>
               </w:rPr>
-              <w:t>[licencia y atribución]</w:t>
+              <w:t>[celda]</w:t>
             </w:r>
           </w:p>
+        </w:tc>
+        <w:tc>
+          <w:tcPr>
+            <w:tcW w:type="dxa" w:w="3118"/>
+          </w:tcPr>
           <w:p>
-            <w:pPr>
-              <w:spacing w:after="40"/>
-            </w:pPr>
-            <w:r>
-              <w:rPr>
-                <w:b/>
-                <w:i w:val="0"/>
-                <w:sz w:val="21"/>
-              </w:rPr>
-              <w:t xml:space="preserve">Referencia: </w:t>
-            </w:r>
+            <w:r/>
             <w:r>
               <w:rPr>
                 <w:b w:val="0"/>
                 <w:i w:val="0"/>
-                <w:color w:val="6E738C"/>
-                <w:sz w:val="21"/>
+                <w:sz w:val="20"/>
               </w:rPr>
-              <w:t>[referencia en APA]</w:t>
+              <w:t>[celda]</w:t>
             </w:r>
           </w:p>
+        </w:tc>
+        <w:tc>
+          <w:tcPr>
+            <w:tcW w:type="dxa" w:w="3118"/>
+          </w:tcPr>
           <w:p>
-            <w:pPr>
-              <w:spacing w:before="80" w:after="0"/>
-            </w:pPr>
+            <w:r/>
             <w:r>
               <w:rPr>
-                <w:i/>
-                <w:color w:val="6E738C"/>
-                <w:sz w:val="18"/>
+                <w:b w:val="0"/>
+                <w:i w:val="0"/>
+                <w:sz w:val="20"/>
               </w:rPr>
-              <w:t>La duración se comprueba contra el archivo: si no coincide, esa pieza se detiene.</w:t>
+              <w:t>[celda]</w:t>
             </w:r>
           </w:p>
         </w:tc>
@@ -2658,244 +1800,78 @@
       </w:pPr>
     </w:p>
     <w:p>
-      <w:pPr>
-        <w:pStyle w:val="Heading1"/>
-      </w:pPr>
       <w:r>
-        <w:t>Conclusión</w:t>
+        <w:t>Nota. [si la tiene]</w:t>
+      </w:r>
+    </w:p>
+    <w:p>
+      <w:r>
+        <w:t>Fuente: [si la tiene]</w:t>
       </w:r>
     </w:p>
     <w:p>
       <w:pPr>
-        <w:spacing w:after="200"/>
+        <w:spacing w:after="40"/>
       </w:pPr>
       <w:r>
         <w:rPr>
-          <w:i/>
-          <w:color w:val="6E738C"/>
-          <w:sz w:val="19"/>
+          <w:b/>
+          <w:color w:val="FF0000"/>
         </w:rPr>
-        <w:t>Uno o dos párrafos de cierre, escritos una sola vez.</w:t>
+        <w:t>Banner destacado</w:t>
       </w:r>
     </w:p>
     <w:p>
       <w:r>
-        <w:t>[Párrafo de cierre.]</w:t>
+        <w:t>[una sola frase, de hasta 25 palabras]</w:t>
       </w:r>
     </w:p>
-    <w:tbl>
-      <w:tblPr>
-        <w:tblW w:type="auto" w:w="0"/>
-        <w:jc w:val="left"/>
-        <w:tblLook w:firstColumn="1" w:firstRow="1" w:lastColumn="0" w:lastRow="0" w:noHBand="0" w:noVBand="1" w:val="04A0"/>
-      </w:tblPr>
-      <w:tblGrid>
-        <w:gridCol w:w="9518"/>
-      </w:tblGrid>
-      <w:tr>
-        <w:tc>
-          <w:tcPr>
-            <w:tcW w:type="dxa" w:w="9518"/>
-            <w:shd w:fill="EFECF7"/>
-            <w:tcBorders>
-              <w:left w:val="single" w:sz="30" w:color="503B96"/>
-              <w:top w:val="single" w:sz="6" w:color="EFECF7"/>
-              <w:bottom w:val="single" w:sz="6" w:color="EFECF7"/>
-              <w:right w:val="single" w:sz="6" w:color="EFECF7"/>
-            </w:tcBorders>
-            <w:tcMar>
-              <w:top w:w="100" w:type="dxa"/>
-              <w:bottom w:w="100" w:type="dxa"/>
-              <w:left w:w="160" w:type="dxa"/>
-              <w:right w:w="160" w:type="dxa"/>
-            </w:tcMar>
-          </w:tcPr>
-          <w:p>
-            <w:pPr>
-              <w:spacing w:after="80"/>
-            </w:pPr>
-            <w:r/>
-            <w:r>
-              <w:rPr>
-                <w:b/>
-                <w:color w:val="503B96"/>
-                <w:sz w:val="16"/>
-                <w:spacing w:val="30"/>
-              </w:rPr>
-              <w:t>COMPONENTE</w:t>
-            </w:r>
-          </w:p>
-          <w:p>
-            <w:pPr>
-              <w:spacing w:after="40"/>
-            </w:pPr>
-            <w:r>
-              <w:rPr>
-                <w:b/>
-                <w:i w:val="0"/>
-                <w:sz w:val="21"/>
-              </w:rPr>
-              <w:t>Frase para destacar</w:t>
-            </w:r>
-          </w:p>
-          <w:p>
-            <w:pPr>
-              <w:spacing w:after="40"/>
-            </w:pPr>
-            <w:r>
-              <w:rPr>
-                <w:b/>
-                <w:i w:val="0"/>
-                <w:sz w:val="21"/>
-              </w:rPr>
-              <w:t xml:space="preserve">Frase: </w:t>
-            </w:r>
-            <w:r>
-              <w:rPr>
-                <w:b w:val="0"/>
-                <w:i w:val="0"/>
-                <w:color w:val="6E738C"/>
-                <w:sz w:val="21"/>
-              </w:rPr>
-              <w:t>[la frase del cierre que puede ir en una banda; se toma del propio texto]</w:t>
-            </w:r>
-          </w:p>
-        </w:tc>
-      </w:tr>
-    </w:tbl>
     <w:p>
       <w:pPr>
-        <w:spacing w:after="80"/>
+        <w:spacing w:after="40"/>
       </w:pPr>
+      <w:r>
+        <w:t>Ponte a prueba</w:t>
+      </w:r>
     </w:p>
-    <w:tbl>
-      <w:tblPr>
-        <w:tblW w:type="auto" w:w="0"/>
-        <w:jc w:val="left"/>
-        <w:tblLook w:firstColumn="1" w:firstRow="1" w:lastColumn="0" w:lastRow="0" w:noHBand="0" w:noVBand="1" w:val="04A0"/>
-      </w:tblPr>
-      <w:tblGrid>
-        <w:gridCol w:w="9518"/>
-      </w:tblGrid>
-      <w:tr>
-        <w:tc>
-          <w:tcPr>
-            <w:tcW w:type="dxa" w:w="9518"/>
-            <w:shd w:fill="EFECF7"/>
-            <w:tcBorders>
-              <w:left w:val="single" w:sz="30" w:color="503B96"/>
-              <w:top w:val="single" w:sz="6" w:color="EFECF7"/>
-              <w:bottom w:val="single" w:sz="6" w:color="EFECF7"/>
-              <w:right w:val="single" w:sz="6" w:color="EFECF7"/>
-            </w:tcBorders>
-            <w:tcMar>
-              <w:top w:w="100" w:type="dxa"/>
-              <w:bottom w:w="100" w:type="dxa"/>
-              <w:left w:w="160" w:type="dxa"/>
-              <w:right w:w="160" w:type="dxa"/>
-            </w:tcMar>
-          </w:tcPr>
-          <w:p>
-            <w:pPr>
-              <w:spacing w:after="80"/>
-            </w:pPr>
-            <w:r/>
-            <w:r>
-              <w:rPr>
-                <w:b/>
-                <w:color w:val="503B96"/>
-                <w:sz w:val="16"/>
-                <w:spacing w:val="30"/>
-              </w:rPr>
-              <w:t>COMPONENTE</w:t>
-            </w:r>
-          </w:p>
-          <w:p>
-            <w:pPr>
-              <w:spacing w:after="40"/>
-            </w:pPr>
-            <w:r>
-              <w:rPr>
-                <w:b/>
-                <w:i w:val="0"/>
-                <w:sz w:val="21"/>
-              </w:rPr>
-              <w:t>Pódcast: [título del episodio]</w:t>
-            </w:r>
-          </w:p>
-          <w:p>
-            <w:pPr>
-              <w:spacing w:after="40"/>
-            </w:pPr>
-            <w:r>
-              <w:rPr>
-                <w:b/>
-                <w:i w:val="0"/>
-                <w:sz w:val="21"/>
-              </w:rPr>
-              <w:t xml:space="preserve">Archivo: </w:t>
-            </w:r>
-            <w:r>
-              <w:rPr>
-                <w:b w:val="0"/>
-                <w:i w:val="0"/>
-                <w:color w:val="6E738C"/>
-                <w:sz w:val="21"/>
-              </w:rPr>
-              <w:t>[nombre del MP3 en media/]</w:t>
-            </w:r>
-          </w:p>
-          <w:p>
-            <w:pPr>
-              <w:spacing w:after="40"/>
-            </w:pPr>
-            <w:r>
-              <w:rPr>
-                <w:b/>
-                <w:i w:val="0"/>
-                <w:sz w:val="21"/>
-              </w:rPr>
-              <w:t xml:space="preserve">Duración: </w:t>
-            </w:r>
-            <w:r>
-              <w:rPr>
-                <w:b w:val="0"/>
-                <w:i w:val="0"/>
-                <w:color w:val="6E738C"/>
-                <w:sz w:val="21"/>
-              </w:rPr>
-              <w:t>[minutos y segundos reales]</w:t>
-            </w:r>
-          </w:p>
-          <w:p>
-            <w:pPr>
-              <w:spacing w:after="40"/>
-            </w:pPr>
-            <w:r>
-              <w:rPr>
-                <w:b/>
-                <w:i w:val="0"/>
-                <w:sz w:val="21"/>
-              </w:rPr>
-              <w:t xml:space="preserve">Invitado: </w:t>
-            </w:r>
-            <w:r>
-              <w:rPr>
-                <w:b w:val="0"/>
-                <w:i w:val="0"/>
-                <w:color w:val="6E738C"/>
-                <w:sz w:val="21"/>
-              </w:rPr>
-              <w:t>[si lo hay]</w:t>
-            </w:r>
-          </w:p>
-        </w:tc>
-      </w:tr>
-    </w:tbl>
+    <w:p>
+      <w:r>
+        <w:t>[un caso y lo que el estudiante debe resolver antes de avanzar]</w:t>
+      </w:r>
+    </w:p>
+    <w:p>
+      <w:r>
+        <w:t>[Frase que presenta el PDF.]</w:t>
+      </w:r>
+    </w:p>
     <w:p>
       <w:pPr>
-        <w:spacing w:after="80"/>
+        <w:spacing w:after="40"/>
       </w:pPr>
+      <w:r>
+        <w:rPr>
+          <w:b/>
+          <w:color w:val="FF0000"/>
+        </w:rPr>
+        <w:t>Vincular PDF1</w:t>
+      </w:r>
+    </w:p>
+    <w:p>
+      <w:r>
+        <w:t>[Frase que presenta el video.]</w:t>
+      </w:r>
+    </w:p>
+    <w:p>
+      <w:pPr>
+        <w:spacing w:after="40"/>
+      </w:pPr>
+      <w:r>
+        <w:rPr>
+          <w:b/>
+          <w:color w:val="FF0000"/>
+        </w:rPr>
+        <w:t>Vincular video [enlace de YouTube o Vimeo]</w:t>
+      </w:r>
     </w:p>
     <w:p>
       <w:pPr>
@@ -2915,16 +1891,49 @@
           <w:color w:val="6E738C"/>
           <w:sz w:val="19"/>
         </w:rPr>
-        <w:t>Formato APA, una por línea, en orden alfabético.</w:t>
+        <w:t>Formato APA, una por párrafo, en orden alfabético y solo las citadas en el texto. Autor y año sin negrilla, el título de la obra en cursiva, sin enlaces.</w:t>
       </w:r>
     </w:p>
     <w:p>
+      <w:pPr>
+        <w:spacing w:after="160"/>
+      </w:pPr>
       <w:r>
-        <w:t>[Referencia 1.]</w:t>
+        <w:rPr>
+          <w:b w:val="0"/>
+          <w:i w:val="0"/>
+          <w:sz w:val="22"/>
+        </w:rPr>
+        <w:t xml:space="preserve">Apellido, N. (Año). </w:t>
+      </w:r>
+      <w:r>
+        <w:rPr>
+          <w:b w:val="0"/>
+          <w:i/>
+          <w:sz w:val="22"/>
+        </w:rPr>
+        <w:t>Título de la obra</w:t>
+      </w:r>
+      <w:r>
+        <w:rPr>
+          <w:b w:val="0"/>
+          <w:i w:val="0"/>
+          <w:sz w:val="22"/>
+        </w:rPr>
+        <w:t>. Editorial.</w:t>
       </w:r>
     </w:p>
     <w:p>
+      <w:pPr>
+        <w:spacing w:after="160"/>
+      </w:pPr>
       <w:r>
+        <w:rPr>
+          <w:b w:val="0"/>
+          <w:i w:val="0"/>
+          <w:color w:val="6E738C"/>
+          <w:sz w:val="22"/>
+        </w:rPr>
         <w:t>[Referencia 2.]</w:t>
       </w:r>
     </w:p>
@@ -2998,7 +2007,7 @@
                 <w:i w:val="0"/>
                 <w:sz w:val="20"/>
               </w:rPr>
-              <w:t>Ninguna línea quedó sin clasificar</w:t>
+              <w:t>Cada componente lleva su nombre en rojo</w:t>
             </w:r>
           </w:p>
         </w:tc>
@@ -3014,7 +2023,7 @@
                 <w:i w:val="0"/>
                 <w:sz w:val="20"/>
               </w:rPr>
-              <w:t>O es contenido suelto, o está dentro de una caja.</w:t>
+              <w:t>En su propia línea, con «Título:» debajo si lo tiene.</w:t>
             </w:r>
           </w:p>
         </w:tc>
@@ -3032,7 +2041,7 @@
                 <w:i w:val="0"/>
                 <w:sz w:val="20"/>
               </w:rPr>
-              <w:t>Cada componente dice qué bloque es</w:t>
+              <w:t>Cada parte va en tres líneas</w:t>
             </w:r>
           </w:p>
         </w:tc>
@@ -3048,7 +2057,7 @@
                 <w:i w:val="0"/>
                 <w:sz w:val="20"/>
               </w:rPr>
-              <w:t>La primera línea de la caja violeta lleva el rótulo, y el título solo si el bloque lo tiene.</w:t>
+              <w:t>«Tarjeta 1», el título en negrilla y el texto; todas las partes de un bloque con la misma forma.</w:t>
             </w:r>
           </w:p>
         </w:tc>
@@ -3066,7 +2075,7 @@
                 <w:i w:val="0"/>
                 <w:sz w:val="20"/>
               </w:rPr>
-              <w:t>Cada figura está puesta donde va</w:t>
+              <w:t>Los rótulos que se leen van en color de texto</w:t>
             </w:r>
           </w:p>
         </w:tc>
@@ -3082,7 +2091,7 @@
                 <w:i w:val="0"/>
                 <w:sz w:val="20"/>
               </w:rPr>
-              <w:t>La caja ámbar se escribe en el punto de la pantalla donde debe verse la figura, y su número es el del archivo del diseñador.</w:t>
+              <w:t>Importante, Idea clave, Ponte a prueba… en su línea, con el párrafo debajo.</w:t>
             </w:r>
           </w:p>
         </w:tc>
@@ -3100,7 +2109,7 @@
                 <w:i w:val="0"/>
                 <w:sz w:val="20"/>
               </w:rPr>
-              <w:t>Las duraciones son las reales</w:t>
+              <w:t>Cada imagen está vinculada y entregada</w:t>
             </w:r>
           </w:p>
         </w:tc>
@@ -3116,7 +2125,41 @@
                 <w:i w:val="0"/>
                 <w:sz w:val="20"/>
               </w:rPr>
-              <w:t>Video y pódcast: lo que declara el documento es lo que mide el archivo.</w:t>
+              <w:t>«Vincular Imagen-N» en el sitio exacto, y el PNG con ese nombre en Imagenes/.</w:t>
+            </w:r>
+          </w:p>
+        </w:tc>
+      </w:tr>
+      <w:tr>
+        <w:tc>
+          <w:tcPr>
+            <w:tcW w:type="dxa" w:w="3742"/>
+          </w:tcPr>
+          <w:p>
+            <w:r/>
+            <w:r>
+              <w:rPr>
+                <w:b w:val="0"/>
+                <w:i w:val="0"/>
+                <w:sz w:val="20"/>
+              </w:rPr>
+              <w:t>Las negrillas están donde el curso debe destacar</w:t>
+            </w:r>
+          </w:p>
+        </w:tc>
+        <w:tc>
+          <w:tcPr>
+            <w:tcW w:type="dxa" w:w="5556"/>
+          </w:tcPr>
+          <w:p>
+            <w:r/>
+            <w:r>
+              <w:rPr>
+                <w:b w:val="0"/>
+                <w:i w:val="0"/>
+                <w:sz w:val="20"/>
+              </w:rPr>
+              <w:t>Una por frase; se verifican tramo por tramo.</w:t>
             </w:r>
           </w:p>
         </w:tc>

</xml_diff>

<commit_message>
Cifra destacada: el campo «Rótulo» pasa a «Frase corta» y va bajo la cifra
Co-Authored-By: Claude Fable 5.1 <noreply@anthropic.com>
</commit_message>
<xml_diff>
--- a/fuente/assets/descargas/PLANTILLA-UNIDAD-SCALA.docx
+++ b/fuente/assets/descargas/PLANTILLA-UNIDAD-SCALA.docx
@@ -1137,28 +1137,6 @@
           <w:i w:val="0"/>
           <w:sz w:val="22"/>
         </w:rPr>
-        <w:t xml:space="preserve">Título: </w:t>
-      </w:r>
-      <w:r>
-        <w:rPr>
-          <w:b w:val="0"/>
-          <w:i w:val="0"/>
-          <w:color w:val="6E738C"/>
-          <w:sz w:val="22"/>
-        </w:rPr>
-        <w:t>[rótulo que se lee encima del texto, p. ej. Dato con evidencia]</w:t>
-      </w:r>
-    </w:p>
-    <w:p>
-      <w:pPr>
-        <w:spacing w:after="40"/>
-      </w:pPr>
-      <w:r>
-        <w:rPr>
-          <w:b/>
-          <w:i w:val="0"/>
-          <w:sz w:val="22"/>
-        </w:rPr>
         <w:t xml:space="preserve">Cifra: </w:t>
       </w:r>
       <w:r>
@@ -1181,7 +1159,7 @@
           <w:i w:val="0"/>
           <w:sz w:val="22"/>
         </w:rPr>
-        <w:t xml:space="preserve">Rótulo: </w:t>
+        <w:t xml:space="preserve">Frase corta: </w:t>
       </w:r>
       <w:r>
         <w:rPr>
@@ -1190,7 +1168,29 @@
           <w:color w:val="6E738C"/>
           <w:sz w:val="22"/>
         </w:rPr>
-        <w:t>[qué mide; hasta 12 palabras]</w:t>
+        <w:t>[qué mide; hasta 12 palabras; va bajo la cifra]</w:t>
+      </w:r>
+    </w:p>
+    <w:p>
+      <w:pPr>
+        <w:spacing w:after="40"/>
+      </w:pPr>
+      <w:r>
+        <w:rPr>
+          <w:b/>
+          <w:i w:val="0"/>
+          <w:sz w:val="22"/>
+        </w:rPr>
+        <w:t xml:space="preserve">Título: </w:t>
+      </w:r>
+      <w:r>
+        <w:rPr>
+          <w:b w:val="0"/>
+          <w:i w:val="0"/>
+          <w:color w:val="6E738C"/>
+          <w:sz w:val="22"/>
+        </w:rPr>
+        <w:t>[rótulo que se lee encima del texto, p. ej. Dato con evidencia]</w:t>
       </w:r>
     </w:p>
     <w:p>

</xml_diff>

<commit_message>
Tarjeta con icono y Nota lateral: el nombre del componente en rojo encima del rótulo
Co-Authored-By: Claude Fable 5.1 <noreply@anthropic.com>
</commit_message>
<xml_diff>
--- a/fuente/assets/descargas/PLANTILLA-UNIDAD-SCALA.docx
+++ b/fuente/assets/descargas/PLANTILLA-UNIDAD-SCALA.docx
@@ -57,7 +57,7 @@
           <w:i w:val="0"/>
           <w:sz w:val="22"/>
         </w:rPr>
-        <w:t>Lo que va en rojo es una instrucción para producción y no se ve en el curso: el nombre de un componente, «Título:», «Tarjeta 1», «Vincular…». Y los rótulos que el estudiante sí lee (Importante, Idea clave…) van en el color del texto, en su propia línea.</w:t>
+        <w:t>Lo que va en rojo es una instrucción para producción y no se ve en el curso: el nombre de un componente, «Título:», «Tarjeta 1», «Vincular…». Y los rótulos que el estudiante sí lee (Importante, Idea clave…) van en el color del texto, en su propia línea, debajo de la línea roja «Tarjeta con icono».</w:t>
       </w:r>
     </w:p>
     <w:p>
@@ -76,6 +76,18 @@
     <w:p>
       <w:r>
         <w:t>Vuelva al caso de Red Salud Wari. El tablero y el reporte informan cifras distintas del mismo mes.</w:t>
+      </w:r>
+    </w:p>
+    <w:p>
+      <w:pPr>
+        <w:spacing w:after="40"/>
+      </w:pPr>
+      <w:r>
+        <w:rPr>
+          <w:b w:val="0"/>
+          <w:color w:val="FF0000"/>
+        </w:rPr>
+        <w:t>Tarjeta con icono</w:t>
       </w:r>
     </w:p>
     <w:p>
@@ -121,7 +133,7 @@
       </w:pPr>
       <w:r>
         <w:rPr>
-          <w:b/>
+          <w:b w:val="0"/>
           <w:color w:val="FF0000"/>
         </w:rPr>
         <w:t>Carrusel</w:t>
@@ -232,7 +244,7 @@
       </w:pPr>
       <w:r>
         <w:rPr>
-          <w:b/>
+          <w:b w:val="0"/>
           <w:color w:val="FF0000"/>
         </w:rPr>
         <w:t>Vincular Imagen-02</w:t>
@@ -287,7 +299,7 @@
           <w:i w:val="0"/>
           <w:sz w:val="22"/>
         </w:rPr>
-        <w:t xml:space="preserve"> Acordeón, Carrusel, Pestañas, Pasos, Pasos con detalle, Comparativo, Puntos de interés, Ventana de detalle, Banner destacado, Cifra destacada, Cita, Infografía, Ciclo, Línea de tiempo. Si dice Carrusel, sale carrusel.</w:t>
+        <w:t xml:space="preserve"> Tarjeta con icono, Nota lateral, Acordeón, Carrusel, Pestañas, Pasos, Pasos con detalle, Comparativo, Puntos de interés, Ventana de detalle, Banner destacado, Cifra destacada, Cita, Infografía, Ciclo, Línea de tiempo. Si dice Carrusel, sale carrusel.</w:t>
       </w:r>
     </w:p>
     <w:p>
@@ -747,7 +759,7 @@
       </w:pPr>
       <w:r>
         <w:rPr>
-          <w:b/>
+          <w:b w:val="0"/>
           <w:color w:val="FF0000"/>
         </w:rPr>
         <w:t>Vincular Imagen-01</w:t>
@@ -936,7 +948,7 @@
       </w:pPr>
       <w:r>
         <w:rPr>
-          <w:b/>
+          <w:b w:val="0"/>
           <w:color w:val="FF0000"/>
         </w:rPr>
         <w:t>Acordeón</w:t>
@@ -1094,6 +1106,18 @@
         <w:spacing w:after="40"/>
       </w:pPr>
       <w:r>
+        <w:rPr>
+          <w:b w:val="0"/>
+          <w:color w:val="FF0000"/>
+        </w:rPr>
+        <w:t>Tarjeta con icono</w:t>
+      </w:r>
+    </w:p>
+    <w:p>
+      <w:pPr>
+        <w:spacing w:after="40"/>
+      </w:pPr>
+      <w:r>
         <w:t>Importante</w:t>
       </w:r>
     </w:p>
@@ -1112,7 +1136,7 @@
           <w:color w:val="6E738C"/>
           <w:sz w:val="19"/>
         </w:rPr>
-        <w:t>Rótulos que el estudiante lee: Idea clave · Importante · Para tener en cuenta · Clave de aplicación · Criterio de aceptación · Atención · Error frecuente · Para reflexionar · Ponte a prueba · Dato curioso.</w:t>
+        <w:t>Rótulos de tarjeta, siempre bajo la línea roja «Tarjeta con icono»: Idea clave · Importante · Para tener en cuenta · Clave de aplicación · Criterio de aceptación · Atención · Error frecuente · Para reflexionar · Ponte a prueba. «Dato curioso» va bajo «Nota lateral».</w:t>
       </w:r>
     </w:p>
     <w:p>
@@ -1121,7 +1145,7 @@
       </w:pPr>
       <w:r>
         <w:rPr>
-          <w:b/>
+          <w:b w:val="0"/>
           <w:color w:val="FF0000"/>
         </w:rPr>
         <w:t>Cifra destacada</w:t>
@@ -1248,7 +1272,7 @@
       </w:pPr>
       <w:r>
         <w:rPr>
-          <w:b/>
+          <w:b w:val="0"/>
           <w:color w:val="FF0000"/>
         </w:rPr>
         <w:t>Vincular Imagen-02</w:t>
@@ -1407,7 +1431,7 @@
       </w:pPr>
       <w:r>
         <w:rPr>
-          <w:b/>
+          <w:b w:val="0"/>
           <w:color w:val="FF0000"/>
         </w:rPr>
         <w:t>Comparativo</w:t>
@@ -1477,7 +1501,7 @@
       </w:pPr>
       <w:r>
         <w:rPr>
-          <w:b/>
+          <w:b w:val="0"/>
           <w:color w:val="FF0000"/>
         </w:rPr>
         <w:t>Pasos con detalle</w:t>
@@ -1815,7 +1839,7 @@
       </w:pPr>
       <w:r>
         <w:rPr>
-          <w:b/>
+          <w:b w:val="0"/>
           <w:color w:val="FF0000"/>
         </w:rPr>
         <w:t>Banner destacado</w:t>
@@ -1824,6 +1848,18 @@
     <w:p>
       <w:r>
         <w:t>[una sola frase, de hasta 25 palabras]</w:t>
+      </w:r>
+    </w:p>
+    <w:p>
+      <w:pPr>
+        <w:spacing w:after="40"/>
+      </w:pPr>
+      <w:r>
+        <w:rPr>
+          <w:b w:val="0"/>
+          <w:color w:val="FF0000"/>
+        </w:rPr>
+        <w:t>Tarjeta con icono</w:t>
       </w:r>
     </w:p>
     <w:p>
@@ -1850,7 +1886,7 @@
       </w:pPr>
       <w:r>
         <w:rPr>
-          <w:b/>
+          <w:b w:val="0"/>
           <w:color w:val="FF0000"/>
         </w:rPr>
         <w:t>Vincular PDF1</w:t>
@@ -1867,7 +1903,7 @@
       </w:pPr>
       <w:r>
         <w:rPr>
-          <w:b/>
+          <w:b w:val="0"/>
           <w:color w:val="FF0000"/>
         </w:rPr>
         <w:t>Vincular video [enlace de YouTube o Vimeo]</w:t>
@@ -2075,7 +2111,7 @@
                 <w:i w:val="0"/>
                 <w:sz w:val="20"/>
               </w:rPr>
-              <w:t>Los rótulos que se leen van en color de texto</w:t>
+              <w:t>Cada tarjeta lleva «Tarjeta con icono» en rojo</w:t>
             </w:r>
           </w:p>
         </w:tc>
@@ -2091,7 +2127,7 @@
                 <w:i w:val="0"/>
                 <w:sz w:val="20"/>
               </w:rPr>
-              <w:t>Importante, Idea clave, Ponte a prueba… en su línea, con el párrafo debajo.</w:t>
+              <w:t>Y debajo, en color de texto, el rótulo que se lee: Importante, Idea clave, Ponte a prueba… con el párrafo debajo.</w:t>
             </w:r>
           </w:p>
         </w:tc>

</xml_diff>